<commit_message>
Token CSRF, cabecera Authorization, sanitización en el cliente y RLS explícito en envios_portal
</commit_message>
<xml_diff>
--- a/docs/Fase1_Sistema_RRHH.docx
+++ b/docs/Fase1_Sistema_RRHH.docx
@@ -118,7 +118,7 @@
           <w:left w:w="10" w:type="dxa"/>
           <w:right w:w="10" w:type="dxa"/>
         </w:tblCellMar>
-        <w:tblLook w:val="04A0" w:firstRow="1" w:lastRow="0" w:firstColumn="1" w:lastColumn="0" w:noHBand="0" w:noVBand="1"/>
+        <w:tblLook w:val="0000" w:firstRow="0" w:lastRow="0" w:firstColumn="0" w:lastColumn="0" w:noHBand="0" w:noVBand="0"/>
       </w:tblPr>
       <w:tblGrid>
         <w:gridCol w:w="936"/>
@@ -959,7 +959,7 @@
     <w:sdt>
       <w:sdtPr>
         <w:alias w:val="Contenido"/>
-        <w:id w:val="-142435902"/>
+        <w:id w:val="-181362720"/>
       </w:sdtPr>
       <w:sdtEndPr/>
       <w:sdtContent>
@@ -982,7 +982,7 @@
           <w:r>
             <w:fldChar w:fldCharType="separate"/>
           </w:r>
-          <w:hyperlink w:anchor="_Toc241475892" w:history="1">
+          <w:hyperlink w:anchor="_Toc241477589" w:history="1">
             <w:r>
               <w:rPr>
                 <w:rStyle w:val="Hipervnculo"/>
@@ -1006,7 +1006,7 @@
               <w:rPr>
                 <w:noProof/>
               </w:rPr>
-              <w:instrText xml:space="preserve"> PAGEREF _Toc241475892 \h </w:instrText>
+              <w:instrText xml:space="preserve"> PAGEREF _Toc241477589 \h </w:instrText>
             </w:r>
             <w:r>
               <w:rPr>
@@ -1043,7 +1043,7 @@
               <w:noProof/>
             </w:rPr>
           </w:pPr>
-          <w:hyperlink w:anchor="_Toc241475893" w:history="1">
+          <w:hyperlink w:anchor="_Toc241477590" w:history="1">
             <w:r>
               <w:rPr>
                 <w:rStyle w:val="Hipervnculo"/>
@@ -1067,7 +1067,7 @@
               <w:rPr>
                 <w:noProof/>
               </w:rPr>
-              <w:instrText xml:space="preserve"> PAGEREF _Toc241475893 \h </w:instrText>
+              <w:instrText xml:space="preserve"> PAGEREF _Toc241477590 \h </w:instrText>
             </w:r>
             <w:r>
               <w:rPr>
@@ -1104,7 +1104,7 @@
               <w:noProof/>
             </w:rPr>
           </w:pPr>
-          <w:hyperlink w:anchor="_Toc241475894" w:history="1">
+          <w:hyperlink w:anchor="_Toc241477591" w:history="1">
             <w:r>
               <w:rPr>
                 <w:rStyle w:val="Hipervnculo"/>
@@ -1128,7 +1128,7 @@
               <w:rPr>
                 <w:noProof/>
               </w:rPr>
-              <w:instrText xml:space="preserve"> PAGEREF _Toc241475894 \h </w:instrText>
+              <w:instrText xml:space="preserve"> PAGEREF _Toc241477591 \h </w:instrText>
             </w:r>
             <w:r>
               <w:rPr>
@@ -1165,7 +1165,7 @@
               <w:noProof/>
             </w:rPr>
           </w:pPr>
-          <w:hyperlink w:anchor="_Toc241475895" w:history="1">
+          <w:hyperlink w:anchor="_Toc241477592" w:history="1">
             <w:r>
               <w:rPr>
                 <w:rStyle w:val="Hipervnculo"/>
@@ -1189,7 +1189,7 @@
               <w:rPr>
                 <w:noProof/>
               </w:rPr>
-              <w:instrText xml:space="preserve"> PAGEREF _Toc241475895 \h </w:instrText>
+              <w:instrText xml:space="preserve"> PAGEREF _Toc241477592 \h </w:instrText>
             </w:r>
             <w:r>
               <w:rPr>
@@ -1226,7 +1226,7 @@
               <w:noProof/>
             </w:rPr>
           </w:pPr>
-          <w:hyperlink w:anchor="_Toc241475896" w:history="1">
+          <w:hyperlink w:anchor="_Toc241477593" w:history="1">
             <w:r>
               <w:rPr>
                 <w:rStyle w:val="Hipervnculo"/>
@@ -1250,7 +1250,7 @@
               <w:rPr>
                 <w:noProof/>
               </w:rPr>
-              <w:instrText xml:space="preserve"> PAGEREF _Toc241475896 \h </w:instrText>
+              <w:instrText xml:space="preserve"> PAGEREF _Toc241477593 \h </w:instrText>
             </w:r>
             <w:r>
               <w:rPr>
@@ -1287,7 +1287,7 @@
               <w:noProof/>
             </w:rPr>
           </w:pPr>
-          <w:hyperlink w:anchor="_Toc241475897" w:history="1">
+          <w:hyperlink w:anchor="_Toc241477594" w:history="1">
             <w:r>
               <w:rPr>
                 <w:rStyle w:val="Hipervnculo"/>
@@ -1311,7 +1311,7 @@
               <w:rPr>
                 <w:noProof/>
               </w:rPr>
-              <w:instrText xml:space="preserve"> PAGEREF _Toc241475897 \h </w:instrText>
+              <w:instrText xml:space="preserve"> PAGEREF _Toc241477594 \h </w:instrText>
             </w:r>
             <w:r>
               <w:rPr>
@@ -1348,7 +1348,7 @@
               <w:noProof/>
             </w:rPr>
           </w:pPr>
-          <w:hyperlink w:anchor="_Toc241475898" w:history="1">
+          <w:hyperlink w:anchor="_Toc241477595" w:history="1">
             <w:r>
               <w:rPr>
                 <w:rStyle w:val="Hipervnculo"/>
@@ -1372,7 +1372,7 @@
               <w:rPr>
                 <w:noProof/>
               </w:rPr>
-              <w:instrText xml:space="preserve"> PAGEREF _Toc241475898 \h </w:instrText>
+              <w:instrText xml:space="preserve"> PAGEREF _Toc241477595 \h </w:instrText>
             </w:r>
             <w:r>
               <w:rPr>
@@ -1409,7 +1409,7 @@
               <w:noProof/>
             </w:rPr>
           </w:pPr>
-          <w:hyperlink w:anchor="_Toc241475899" w:history="1">
+          <w:hyperlink w:anchor="_Toc241477596" w:history="1">
             <w:r>
               <w:rPr>
                 <w:rStyle w:val="Hipervnculo"/>
@@ -1433,7 +1433,7 @@
               <w:rPr>
                 <w:noProof/>
               </w:rPr>
-              <w:instrText xml:space="preserve"> PAGEREF _Toc241475899 \h </w:instrText>
+              <w:instrText xml:space="preserve"> PAGEREF _Toc241477596 \h </w:instrText>
             </w:r>
             <w:r>
               <w:rPr>
@@ -1470,7 +1470,7 @@
               <w:noProof/>
             </w:rPr>
           </w:pPr>
-          <w:hyperlink w:anchor="_Toc241475900" w:history="1">
+          <w:hyperlink w:anchor="_Toc241477597" w:history="1">
             <w:r>
               <w:rPr>
                 <w:rStyle w:val="Hipervnculo"/>
@@ -1494,7 +1494,7 @@
               <w:rPr>
                 <w:noProof/>
               </w:rPr>
-              <w:instrText xml:space="preserve"> PAGEREF _Toc241475900 \h </w:instrText>
+              <w:instrText xml:space="preserve"> PAGEREF _Toc241477597 \h </w:instrText>
             </w:r>
             <w:r>
               <w:rPr>
@@ -1531,7 +1531,7 @@
               <w:noProof/>
             </w:rPr>
           </w:pPr>
-          <w:hyperlink w:anchor="_Toc241475901" w:history="1">
+          <w:hyperlink w:anchor="_Toc241477598" w:history="1">
             <w:r>
               <w:rPr>
                 <w:rStyle w:val="Hipervnculo"/>
@@ -1555,7 +1555,7 @@
               <w:rPr>
                 <w:noProof/>
               </w:rPr>
-              <w:instrText xml:space="preserve"> PAGEREF _Toc241475901 \h </w:instrText>
+              <w:instrText xml:space="preserve"> PAGEREF _Toc241477598 \h </w:instrText>
             </w:r>
             <w:r>
               <w:rPr>
@@ -1592,7 +1592,7 @@
               <w:noProof/>
             </w:rPr>
           </w:pPr>
-          <w:hyperlink w:anchor="_Toc241475902" w:history="1">
+          <w:hyperlink w:anchor="_Toc241477599" w:history="1">
             <w:r>
               <w:rPr>
                 <w:rStyle w:val="Hipervnculo"/>
@@ -1616,7 +1616,7 @@
               <w:rPr>
                 <w:noProof/>
               </w:rPr>
-              <w:instrText xml:space="preserve"> PAGEREF _Toc241475902 \h </w:instrText>
+              <w:instrText xml:space="preserve"> PAGEREF _Toc241477599 \h </w:instrText>
             </w:r>
             <w:r>
               <w:rPr>
@@ -1653,7 +1653,7 @@
               <w:noProof/>
             </w:rPr>
           </w:pPr>
-          <w:hyperlink w:anchor="_Toc241475903" w:history="1">
+          <w:hyperlink w:anchor="_Toc241477600" w:history="1">
             <w:r>
               <w:rPr>
                 <w:rStyle w:val="Hipervnculo"/>
@@ -1677,7 +1677,7 @@
               <w:rPr>
                 <w:noProof/>
               </w:rPr>
-              <w:instrText xml:space="preserve"> PAGEREF _Toc241475903 \h </w:instrText>
+              <w:instrText xml:space="preserve"> PAGEREF _Toc241477600 \h </w:instrText>
             </w:r>
             <w:r>
               <w:rPr>
@@ -1714,7 +1714,7 @@
               <w:noProof/>
             </w:rPr>
           </w:pPr>
-          <w:hyperlink w:anchor="_Toc241475904" w:history="1">
+          <w:hyperlink w:anchor="_Toc241477601" w:history="1">
             <w:r>
               <w:rPr>
                 <w:rStyle w:val="Hipervnculo"/>
@@ -1738,7 +1738,7 @@
               <w:rPr>
                 <w:noProof/>
               </w:rPr>
-              <w:instrText xml:space="preserve"> PAGEREF _Toc241475904 \h </w:instrText>
+              <w:instrText xml:space="preserve"> PAGEREF _Toc241477601 \h </w:instrText>
             </w:r>
             <w:r>
               <w:rPr>
@@ -1775,7 +1775,7 @@
               <w:noProof/>
             </w:rPr>
           </w:pPr>
-          <w:hyperlink w:anchor="_Toc241475905" w:history="1">
+          <w:hyperlink w:anchor="_Toc241477602" w:history="1">
             <w:r>
               <w:rPr>
                 <w:rStyle w:val="Hipervnculo"/>
@@ -1799,7 +1799,7 @@
               <w:rPr>
                 <w:noProof/>
               </w:rPr>
-              <w:instrText xml:space="preserve"> PAGEREF _Toc241475905 \h </w:instrText>
+              <w:instrText xml:space="preserve"> PAGEREF _Toc241477602 \h </w:instrText>
             </w:r>
             <w:r>
               <w:rPr>
@@ -1836,7 +1836,7 @@
               <w:noProof/>
             </w:rPr>
           </w:pPr>
-          <w:hyperlink w:anchor="_Toc241475906" w:history="1">
+          <w:hyperlink w:anchor="_Toc241477603" w:history="1">
             <w:r>
               <w:rPr>
                 <w:rStyle w:val="Hipervnculo"/>
@@ -1860,7 +1860,7 @@
               <w:rPr>
                 <w:noProof/>
               </w:rPr>
-              <w:instrText xml:space="preserve"> PAGEREF _Toc241475906 \h </w:instrText>
+              <w:instrText xml:space="preserve"> PAGEREF _Toc241477603 \h </w:instrText>
             </w:r>
             <w:r>
               <w:rPr>
@@ -1897,7 +1897,7 @@
               <w:noProof/>
             </w:rPr>
           </w:pPr>
-          <w:hyperlink w:anchor="_Toc241475907" w:history="1">
+          <w:hyperlink w:anchor="_Toc241477604" w:history="1">
             <w:r>
               <w:rPr>
                 <w:rStyle w:val="Hipervnculo"/>
@@ -1921,7 +1921,7 @@
               <w:rPr>
                 <w:noProof/>
               </w:rPr>
-              <w:instrText xml:space="preserve"> PAGEREF _Toc241475907 \h </w:instrText>
+              <w:instrText xml:space="preserve"> PAGEREF _Toc241477604 \h </w:instrText>
             </w:r>
             <w:r>
               <w:rPr>
@@ -1958,7 +1958,7 @@
               <w:noProof/>
             </w:rPr>
           </w:pPr>
-          <w:hyperlink w:anchor="_Toc241475908" w:history="1">
+          <w:hyperlink w:anchor="_Toc241477605" w:history="1">
             <w:r>
               <w:rPr>
                 <w:rStyle w:val="Hipervnculo"/>
@@ -1982,7 +1982,7 @@
               <w:rPr>
                 <w:noProof/>
               </w:rPr>
-              <w:instrText xml:space="preserve"> PAGEREF _Toc241475908 \h </w:instrText>
+              <w:instrText xml:space="preserve"> PAGEREF _Toc241477605 \h </w:instrText>
             </w:r>
             <w:r>
               <w:rPr>
@@ -2019,7 +2019,7 @@
               <w:noProof/>
             </w:rPr>
           </w:pPr>
-          <w:hyperlink w:anchor="_Toc241475909" w:history="1">
+          <w:hyperlink w:anchor="_Toc241477606" w:history="1">
             <w:r>
               <w:rPr>
                 <w:rStyle w:val="Hipervnculo"/>
@@ -2043,7 +2043,7 @@
               <w:rPr>
                 <w:noProof/>
               </w:rPr>
-              <w:instrText xml:space="preserve"> PAGEREF _Toc241475909 \h </w:instrText>
+              <w:instrText xml:space="preserve"> PAGEREF _Toc241477606 \h </w:instrText>
             </w:r>
             <w:r>
               <w:rPr>
@@ -2080,7 +2080,7 @@
               <w:noProof/>
             </w:rPr>
           </w:pPr>
-          <w:hyperlink w:anchor="_Toc241475910" w:history="1">
+          <w:hyperlink w:anchor="_Toc241477607" w:history="1">
             <w:r>
               <w:rPr>
                 <w:rStyle w:val="Hipervnculo"/>
@@ -2104,7 +2104,7 @@
               <w:rPr>
                 <w:noProof/>
               </w:rPr>
-              <w:instrText xml:space="preserve"> PAGEREF _Toc241475910 \h </w:instrText>
+              <w:instrText xml:space="preserve"> PAGEREF _Toc241477607 \h </w:instrText>
             </w:r>
             <w:r>
               <w:rPr>
@@ -2141,7 +2141,7 @@
               <w:noProof/>
             </w:rPr>
           </w:pPr>
-          <w:hyperlink w:anchor="_Toc241475911" w:history="1">
+          <w:hyperlink w:anchor="_Toc241477608" w:history="1">
             <w:r>
               <w:rPr>
                 <w:rStyle w:val="Hipervnculo"/>
@@ -2165,7 +2165,7 @@
               <w:rPr>
                 <w:noProof/>
               </w:rPr>
-              <w:instrText xml:space="preserve"> PAGEREF _Toc241475911 \h </w:instrText>
+              <w:instrText xml:space="preserve"> PAGEREF _Toc241477608 \h </w:instrText>
             </w:r>
             <w:r>
               <w:rPr>
@@ -2202,7 +2202,7 @@
               <w:noProof/>
             </w:rPr>
           </w:pPr>
-          <w:hyperlink w:anchor="_Toc241475912" w:history="1">
+          <w:hyperlink w:anchor="_Toc241477609" w:history="1">
             <w:r>
               <w:rPr>
                 <w:rStyle w:val="Hipervnculo"/>
@@ -2226,7 +2226,7 @@
               <w:rPr>
                 <w:noProof/>
               </w:rPr>
-              <w:instrText xml:space="preserve"> PAGEREF _Toc241475912 \h </w:instrText>
+              <w:instrText xml:space="preserve"> PAGEREF _Toc241477609 \h </w:instrText>
             </w:r>
             <w:r>
               <w:rPr>
@@ -2263,7 +2263,7 @@
               <w:noProof/>
             </w:rPr>
           </w:pPr>
-          <w:hyperlink w:anchor="_Toc241475913" w:history="1">
+          <w:hyperlink w:anchor="_Toc241477610" w:history="1">
             <w:r>
               <w:rPr>
                 <w:rStyle w:val="Hipervnculo"/>
@@ -2287,7 +2287,7 @@
               <w:rPr>
                 <w:noProof/>
               </w:rPr>
-              <w:instrText xml:space="preserve"> PAGEREF _Toc241475913 \h </w:instrText>
+              <w:instrText xml:space="preserve"> PAGEREF _Toc241477610 \h </w:instrText>
             </w:r>
             <w:r>
               <w:rPr>
@@ -2324,7 +2324,7 @@
               <w:noProof/>
             </w:rPr>
           </w:pPr>
-          <w:hyperlink w:anchor="_Toc241475914" w:history="1">
+          <w:hyperlink w:anchor="_Toc241477611" w:history="1">
             <w:r>
               <w:rPr>
                 <w:rStyle w:val="Hipervnculo"/>
@@ -2348,7 +2348,7 @@
               <w:rPr>
                 <w:noProof/>
               </w:rPr>
-              <w:instrText xml:space="preserve"> PAGEREF _Toc241475914 \h </w:instrText>
+              <w:instrText xml:space="preserve"> PAGEREF _Toc241477611 \h </w:instrText>
             </w:r>
             <w:r>
               <w:rPr>
@@ -2385,7 +2385,7 @@
               <w:noProof/>
             </w:rPr>
           </w:pPr>
-          <w:hyperlink w:anchor="_Toc241475915" w:history="1">
+          <w:hyperlink w:anchor="_Toc241477612" w:history="1">
             <w:r>
               <w:rPr>
                 <w:rStyle w:val="Hipervnculo"/>
@@ -2409,7 +2409,7 @@
               <w:rPr>
                 <w:noProof/>
               </w:rPr>
-              <w:instrText xml:space="preserve"> PAGEREF _Toc241475915 \h </w:instrText>
+              <w:instrText xml:space="preserve"> PAGEREF _Toc241477612 \h </w:instrText>
             </w:r>
             <w:r>
               <w:rPr>
@@ -2446,7 +2446,7 @@
               <w:noProof/>
             </w:rPr>
           </w:pPr>
-          <w:hyperlink w:anchor="_Toc241475916" w:history="1">
+          <w:hyperlink w:anchor="_Toc241477613" w:history="1">
             <w:r>
               <w:rPr>
                 <w:rStyle w:val="Hipervnculo"/>
@@ -2470,7 +2470,7 @@
               <w:rPr>
                 <w:noProof/>
               </w:rPr>
-              <w:instrText xml:space="preserve"> PAGEREF _Toc241475916 \h </w:instrText>
+              <w:instrText xml:space="preserve"> PAGEREF _Toc241477613 \h </w:instrText>
             </w:r>
             <w:r>
               <w:rPr>
@@ -2507,7 +2507,7 @@
               <w:noProof/>
             </w:rPr>
           </w:pPr>
-          <w:hyperlink w:anchor="_Toc241475917" w:history="1">
+          <w:hyperlink w:anchor="_Toc241477614" w:history="1">
             <w:r>
               <w:rPr>
                 <w:rStyle w:val="Hipervnculo"/>
@@ -2531,7 +2531,7 @@
               <w:rPr>
                 <w:noProof/>
               </w:rPr>
-              <w:instrText xml:space="preserve"> PAGEREF _Toc241475917 \h </w:instrText>
+              <w:instrText xml:space="preserve"> PAGEREF _Toc241477614 \h </w:instrText>
             </w:r>
             <w:r>
               <w:rPr>
@@ -2568,7 +2568,7 @@
               <w:noProof/>
             </w:rPr>
           </w:pPr>
-          <w:hyperlink w:anchor="_Toc241475918" w:history="1">
+          <w:hyperlink w:anchor="_Toc241477615" w:history="1">
             <w:r>
               <w:rPr>
                 <w:rStyle w:val="Hipervnculo"/>
@@ -2592,7 +2592,7 @@
               <w:rPr>
                 <w:noProof/>
               </w:rPr>
-              <w:instrText xml:space="preserve"> PAGEREF _Toc241475918 \h </w:instrText>
+              <w:instrText xml:space="preserve"> PAGEREF _Toc241477615 \h </w:instrText>
             </w:r>
             <w:r>
               <w:rPr>
@@ -2629,7 +2629,7 @@
               <w:noProof/>
             </w:rPr>
           </w:pPr>
-          <w:hyperlink w:anchor="_Toc241475919" w:history="1">
+          <w:hyperlink w:anchor="_Toc241477616" w:history="1">
             <w:r>
               <w:rPr>
                 <w:rStyle w:val="Hipervnculo"/>
@@ -2653,7 +2653,7 @@
               <w:rPr>
                 <w:noProof/>
               </w:rPr>
-              <w:instrText xml:space="preserve"> PAGEREF _Toc241475919 \h </w:instrText>
+              <w:instrText xml:space="preserve"> PAGEREF _Toc241477616 \h </w:instrText>
             </w:r>
             <w:r>
               <w:rPr>
@@ -2690,7 +2690,7 @@
               <w:noProof/>
             </w:rPr>
           </w:pPr>
-          <w:hyperlink w:anchor="_Toc241475920" w:history="1">
+          <w:hyperlink w:anchor="_Toc241477617" w:history="1">
             <w:r>
               <w:rPr>
                 <w:rStyle w:val="Hipervnculo"/>
@@ -2714,7 +2714,7 @@
               <w:rPr>
                 <w:noProof/>
               </w:rPr>
-              <w:instrText xml:space="preserve"> PAGEREF _Toc241475920 \h </w:instrText>
+              <w:instrText xml:space="preserve"> PAGEREF _Toc241477617 \h </w:instrText>
             </w:r>
             <w:r>
               <w:rPr>
@@ -2751,7 +2751,7 @@
               <w:noProof/>
             </w:rPr>
           </w:pPr>
-          <w:hyperlink w:anchor="_Toc241475921" w:history="1">
+          <w:hyperlink w:anchor="_Toc241477618" w:history="1">
             <w:r>
               <w:rPr>
                 <w:rStyle w:val="Hipervnculo"/>
@@ -2775,7 +2775,7 @@
               <w:rPr>
                 <w:noProof/>
               </w:rPr>
-              <w:instrText xml:space="preserve"> PAGEREF _Toc241475921 \h </w:instrText>
+              <w:instrText xml:space="preserve"> PAGEREF _Toc241477618 \h </w:instrText>
             </w:r>
             <w:r>
               <w:rPr>
@@ -2792,7 +2792,7 @@
               <w:rPr>
                 <w:noProof/>
               </w:rPr>
-              <w:t>26</w:t>
+              <w:t>27</w:t>
             </w:r>
             <w:r>
               <w:rPr>
@@ -2812,7 +2812,7 @@
               <w:noProof/>
             </w:rPr>
           </w:pPr>
-          <w:hyperlink w:anchor="_Toc241475922" w:history="1">
+          <w:hyperlink w:anchor="_Toc241477619" w:history="1">
             <w:r>
               <w:rPr>
                 <w:rStyle w:val="Hipervnculo"/>
@@ -2836,7 +2836,7 @@
               <w:rPr>
                 <w:noProof/>
               </w:rPr>
-              <w:instrText xml:space="preserve"> PAGEREF _Toc241475922 \h </w:instrText>
+              <w:instrText xml:space="preserve"> PAGEREF _Toc241477619 \h </w:instrText>
             </w:r>
             <w:r>
               <w:rPr>
@@ -2873,7 +2873,7 @@
               <w:noProof/>
             </w:rPr>
           </w:pPr>
-          <w:hyperlink w:anchor="_Toc241475923" w:history="1">
+          <w:hyperlink w:anchor="_Toc241477620" w:history="1">
             <w:r>
               <w:rPr>
                 <w:rStyle w:val="Hipervnculo"/>
@@ -2897,7 +2897,7 @@
               <w:rPr>
                 <w:noProof/>
               </w:rPr>
-              <w:instrText xml:space="preserve"> PAGEREF _Toc241475923 \h </w:instrText>
+              <w:instrText xml:space="preserve"> PAGEREF _Toc241477620 \h </w:instrText>
             </w:r>
             <w:r>
               <w:rPr>
@@ -2914,7 +2914,7 @@
               <w:rPr>
                 <w:noProof/>
               </w:rPr>
-              <w:t>29</w:t>
+              <w:t>30</w:t>
             </w:r>
             <w:r>
               <w:rPr>
@@ -2934,7 +2934,7 @@
               <w:noProof/>
             </w:rPr>
           </w:pPr>
-          <w:hyperlink w:anchor="_Toc241475924" w:history="1">
+          <w:hyperlink w:anchor="_Toc241477621" w:history="1">
             <w:r>
               <w:rPr>
                 <w:rStyle w:val="Hipervnculo"/>
@@ -2958,7 +2958,7 @@
               <w:rPr>
                 <w:noProof/>
               </w:rPr>
-              <w:instrText xml:space="preserve"> PAGEREF _Toc241475924 \h </w:instrText>
+              <w:instrText xml:space="preserve"> PAGEREF _Toc241477621 \h </w:instrText>
             </w:r>
             <w:r>
               <w:rPr>
@@ -2975,7 +2975,7 @@
               <w:rPr>
                 <w:noProof/>
               </w:rPr>
-              <w:t>29</w:t>
+              <w:t>30</w:t>
             </w:r>
             <w:r>
               <w:rPr>
@@ -2995,7 +2995,7 @@
               <w:noProof/>
             </w:rPr>
           </w:pPr>
-          <w:hyperlink w:anchor="_Toc241475925" w:history="1">
+          <w:hyperlink w:anchor="_Toc241477622" w:history="1">
             <w:r>
               <w:rPr>
                 <w:rStyle w:val="Hipervnculo"/>
@@ -3019,7 +3019,7 @@
               <w:rPr>
                 <w:noProof/>
               </w:rPr>
-              <w:instrText xml:space="preserve"> PAGEREF _Toc241475925 \h </w:instrText>
+              <w:instrText xml:space="preserve"> PAGEREF _Toc241477622 \h </w:instrText>
             </w:r>
             <w:r>
               <w:rPr>
@@ -3036,7 +3036,7 @@
               <w:rPr>
                 <w:noProof/>
               </w:rPr>
-              <w:t>29</w:t>
+              <w:t>30</w:t>
             </w:r>
             <w:r>
               <w:rPr>
@@ -3056,7 +3056,7 @@
               <w:noProof/>
             </w:rPr>
           </w:pPr>
-          <w:hyperlink w:anchor="_Toc241475926" w:history="1">
+          <w:hyperlink w:anchor="_Toc241477623" w:history="1">
             <w:r>
               <w:rPr>
                 <w:rStyle w:val="Hipervnculo"/>
@@ -3080,7 +3080,7 @@
               <w:rPr>
                 <w:noProof/>
               </w:rPr>
-              <w:instrText xml:space="preserve"> PAGEREF _Toc241475926 \h </w:instrText>
+              <w:instrText xml:space="preserve"> PAGEREF _Toc241477623 \h </w:instrText>
             </w:r>
             <w:r>
               <w:rPr>
@@ -3097,7 +3097,7 @@
               <w:rPr>
                 <w:noProof/>
               </w:rPr>
-              <w:t>30</w:t>
+              <w:t>31</w:t>
             </w:r>
             <w:r>
               <w:rPr>
@@ -3117,7 +3117,7 @@
               <w:noProof/>
             </w:rPr>
           </w:pPr>
-          <w:hyperlink w:anchor="_Toc241475927" w:history="1">
+          <w:hyperlink w:anchor="_Toc241477624" w:history="1">
             <w:r>
               <w:rPr>
                 <w:rStyle w:val="Hipervnculo"/>
@@ -3141,7 +3141,7 @@
               <w:rPr>
                 <w:noProof/>
               </w:rPr>
-              <w:instrText xml:space="preserve"> PAGEREF _Toc241475927 \h </w:instrText>
+              <w:instrText xml:space="preserve"> PAGEREF _Toc241477624 \h </w:instrText>
             </w:r>
             <w:r>
               <w:rPr>
@@ -3158,7 +3158,7 @@
               <w:rPr>
                 <w:noProof/>
               </w:rPr>
-              <w:t>31</w:t>
+              <w:t>33</w:t>
             </w:r>
             <w:r>
               <w:rPr>
@@ -3195,7 +3195,7 @@
         <w:pStyle w:val="Ttulo1"/>
         <w:pageBreakBefore/>
       </w:pPr>
-      <w:bookmarkStart w:id="0" w:name="_Toc241475892"/>
+      <w:bookmarkStart w:id="0" w:name="_Toc241477589"/>
       <w:r>
         <w:lastRenderedPageBreak/>
         <w:t>1. Introducción</w:t>
@@ -3275,7 +3275,7 @@
       <w:pPr>
         <w:pStyle w:val="Ttulo2"/>
       </w:pPr>
-      <w:bookmarkStart w:id="1" w:name="_Toc241475893"/>
+      <w:bookmarkStart w:id="1" w:name="_Toc241477590"/>
       <w:r>
         <w:t>1.1 Objetivo</w:t>
       </w:r>
@@ -3296,7 +3296,7 @@
       <w:pPr>
         <w:pStyle w:val="Ttulo2"/>
       </w:pPr>
-      <w:bookmarkStart w:id="2" w:name="_Toc241475894"/>
+      <w:bookmarkStart w:id="2" w:name="_Toc241477591"/>
       <w:r>
         <w:t>1.2 Alcance funcional</w:t>
       </w:r>
@@ -3317,7 +3317,7 @@
           <w:left w:w="10" w:type="dxa"/>
           <w:right w:w="10" w:type="dxa"/>
         </w:tblCellMar>
-        <w:tblLook w:val="04A0" w:firstRow="1" w:lastRow="0" w:firstColumn="1" w:lastColumn="0" w:noHBand="0" w:noVBand="1"/>
+        <w:tblLook w:val="0000" w:firstRow="0" w:lastRow="0" w:firstColumn="0" w:lastColumn="0" w:noHBand="0" w:noVBand="0"/>
       </w:tblPr>
       <w:tblGrid>
         <w:gridCol w:w="2808"/>
@@ -4080,7 +4080,7 @@
       <w:pPr>
         <w:pStyle w:val="Ttulo2"/>
       </w:pPr>
-      <w:bookmarkStart w:id="3" w:name="_Toc241475895"/>
+      <w:bookmarkStart w:id="3" w:name="_Toc241477592"/>
       <w:r>
         <w:t>1.3 Tecnologías</w:t>
       </w:r>
@@ -4101,7 +4101,7 @@
           <w:left w:w="10" w:type="dxa"/>
           <w:right w:w="10" w:type="dxa"/>
         </w:tblCellMar>
-        <w:tblLook w:val="04A0" w:firstRow="1" w:lastRow="0" w:firstColumn="1" w:lastColumn="0" w:noHBand="0" w:noVBand="1"/>
+        <w:tblLook w:val="0000" w:firstRow="0" w:lastRow="0" w:firstColumn="0" w:lastColumn="0" w:noHBand="0" w:noVBand="0"/>
       </w:tblPr>
       <w:tblGrid>
         <w:gridCol w:w="1701"/>
@@ -4809,7 +4809,7 @@
         <w:pStyle w:val="Ttulo1"/>
         <w:pageBreakBefore/>
       </w:pPr>
-      <w:bookmarkStart w:id="4" w:name="_Toc241475896"/>
+      <w:bookmarkStart w:id="4" w:name="_Toc241477593"/>
       <w:r>
         <w:lastRenderedPageBreak/>
         <w:t>A. Matriz de Asignación de Responsabilidades (RACI)</w:t>
@@ -4820,7 +4820,7 @@
       <w:pPr>
         <w:pStyle w:val="Ttulo2"/>
       </w:pPr>
-      <w:bookmarkStart w:id="5" w:name="_Toc241475897"/>
+      <w:bookmarkStart w:id="5" w:name="_Toc241477594"/>
       <w:r>
         <w:t>A.1 Definición del equipo</w:t>
       </w:r>
@@ -4849,7 +4849,7 @@
           <w:left w:w="10" w:type="dxa"/>
           <w:right w:w="10" w:type="dxa"/>
         </w:tblCellMar>
-        <w:tblLook w:val="04A0" w:firstRow="1" w:lastRow="0" w:firstColumn="1" w:lastColumn="0" w:noHBand="0" w:noVBand="1"/>
+        <w:tblLook w:val="0000" w:firstRow="0" w:lastRow="0" w:firstColumn="0" w:lastColumn="0" w:noHBand="0" w:noVBand="0"/>
       </w:tblPr>
       <w:tblGrid>
         <w:gridCol w:w="1030"/>
@@ -5897,7 +5897,7 @@
       <w:pPr>
         <w:pStyle w:val="Ttulo2"/>
       </w:pPr>
-      <w:bookmarkStart w:id="6" w:name="_Toc241475898"/>
+      <w:bookmarkStart w:id="6" w:name="_Toc241477595"/>
       <w:r>
         <w:t>A.2 Matriz RACI por componente</w:t>
       </w:r>
@@ -5963,7 +5963,7 @@
           <w:left w:w="10" w:type="dxa"/>
           <w:right w:w="10" w:type="dxa"/>
         </w:tblCellMar>
-        <w:tblLook w:val="04A0" w:firstRow="1" w:lastRow="0" w:firstColumn="1" w:lastColumn="0" w:noHBand="0" w:noVBand="1"/>
+        <w:tblLook w:val="0000" w:firstRow="0" w:lastRow="0" w:firstColumn="0" w:lastColumn="0" w:noHBand="0" w:noVBand="0"/>
       </w:tblPr>
       <w:tblGrid>
         <w:gridCol w:w="3989"/>
@@ -10779,7 +10779,7 @@
       <w:pPr>
         <w:pStyle w:val="Ttulo2"/>
       </w:pPr>
-      <w:bookmarkStart w:id="7" w:name="_Toc241475899"/>
+      <w:bookmarkStart w:id="7" w:name="_Toc241477596"/>
       <w:r>
         <w:t>A.3 Tareas específicas por integrante</w:t>
       </w:r>
@@ -10818,7 +10818,7 @@
           <w:left w:w="10" w:type="dxa"/>
           <w:right w:w="10" w:type="dxa"/>
         </w:tblCellMar>
-        <w:tblLook w:val="04A0" w:firstRow="1" w:lastRow="0" w:firstColumn="1" w:lastColumn="0" w:noHBand="0" w:noVBand="1"/>
+        <w:tblLook w:val="0000" w:firstRow="0" w:lastRow="0" w:firstColumn="0" w:lastColumn="0" w:noHBand="0" w:noVBand="0"/>
       </w:tblPr>
       <w:tblGrid>
         <w:gridCol w:w="731"/>
@@ -11850,7 +11850,7 @@
           <w:left w:w="10" w:type="dxa"/>
           <w:right w:w="10" w:type="dxa"/>
         </w:tblCellMar>
-        <w:tblLook w:val="04A0" w:firstRow="1" w:lastRow="0" w:firstColumn="1" w:lastColumn="0" w:noHBand="0" w:noVBand="1"/>
+        <w:tblLook w:val="0000" w:firstRow="0" w:lastRow="0" w:firstColumn="0" w:lastColumn="0" w:noHBand="0" w:noVBand="0"/>
       </w:tblPr>
       <w:tblGrid>
         <w:gridCol w:w="738"/>
@@ -12957,7 +12957,7 @@
           <w:left w:w="10" w:type="dxa"/>
           <w:right w:w="10" w:type="dxa"/>
         </w:tblCellMar>
-        <w:tblLook w:val="04A0" w:firstRow="1" w:lastRow="0" w:firstColumn="1" w:lastColumn="0" w:noHBand="0" w:noVBand="1"/>
+        <w:tblLook w:val="0000" w:firstRow="0" w:lastRow="0" w:firstColumn="0" w:lastColumn="0" w:noHBand="0" w:noVBand="0"/>
       </w:tblPr>
       <w:tblGrid>
         <w:gridCol w:w="722"/>
@@ -13524,7 +13524,7 @@
                 <w:sz w:val="19"/>
                 <w:szCs w:val="19"/>
               </w:rPr>
-              <w:t>, cabecera CSRF y manejo de errores</w:t>
+              <w:t>: token CSRF en memoria, sanitización previa al envío y manejo de errores</w:t>
             </w:r>
           </w:p>
         </w:tc>
@@ -14049,7 +14049,7 @@
           <w:left w:w="10" w:type="dxa"/>
           <w:right w:w="10" w:type="dxa"/>
         </w:tblCellMar>
-        <w:tblLook w:val="04A0" w:firstRow="1" w:lastRow="0" w:firstColumn="1" w:lastColumn="0" w:noHBand="0" w:noVBand="1"/>
+        <w:tblLook w:val="0000" w:firstRow="0" w:lastRow="0" w:firstColumn="0" w:lastColumn="0" w:noHBand="0" w:noVBand="0"/>
       </w:tblPr>
       <w:tblGrid>
         <w:gridCol w:w="720"/>
@@ -15117,7 +15117,7 @@
           <w:left w:w="10" w:type="dxa"/>
           <w:right w:w="10" w:type="dxa"/>
         </w:tblCellMar>
-        <w:tblLook w:val="04A0" w:firstRow="1" w:lastRow="0" w:firstColumn="1" w:lastColumn="0" w:noHBand="0" w:noVBand="1"/>
+        <w:tblLook w:val="0000" w:firstRow="0" w:lastRow="0" w:firstColumn="0" w:lastColumn="0" w:noHBand="0" w:noVBand="0"/>
       </w:tblPr>
       <w:tblGrid>
         <w:gridCol w:w="700"/>
@@ -16163,7 +16163,7 @@
           <w:left w:w="10" w:type="dxa"/>
           <w:right w:w="10" w:type="dxa"/>
         </w:tblCellMar>
-        <w:tblLook w:val="04A0" w:firstRow="1" w:lastRow="0" w:firstColumn="1" w:lastColumn="0" w:noHBand="0" w:noVBand="1"/>
+        <w:tblLook w:val="0000" w:firstRow="0" w:lastRow="0" w:firstColumn="0" w:lastColumn="0" w:noHBand="0" w:noVBand="0"/>
       </w:tblPr>
       <w:tblGrid>
         <w:gridCol w:w="716"/>
@@ -16984,7 +16984,7 @@
                 <w:sz w:val="19"/>
                 <w:szCs w:val="19"/>
               </w:rPr>
-              <w:t>Escribir las 58 políticas RLS por rol (admin, rrhh, nomina, jefe, empleado)</w:t>
+              <w:t>Escribir las 57 políticas RLS (55 en tablas y 2 en Storage) por rol (admin, rrhh, nomina, jefe, empleado)</w:t>
             </w:r>
           </w:p>
         </w:tc>
@@ -17241,7 +17241,7 @@
           <w:left w:w="10" w:type="dxa"/>
           <w:right w:w="10" w:type="dxa"/>
         </w:tblCellMar>
-        <w:tblLook w:val="04A0" w:firstRow="1" w:lastRow="0" w:firstColumn="1" w:lastColumn="0" w:noHBand="0" w:noVBand="1"/>
+        <w:tblLook w:val="0000" w:firstRow="0" w:lastRow="0" w:firstColumn="0" w:lastColumn="0" w:noHBand="0" w:noVBand="0"/>
       </w:tblPr>
       <w:tblGrid>
         <w:gridCol w:w="765"/>
@@ -17583,7 +17583,7 @@
                 <w:sz w:val="19"/>
                 <w:szCs w:val="19"/>
               </w:rPr>
-              <w:t xml:space="preserve">Implementar la protección CSRF: cabecera </w:t>
+              <w:t xml:space="preserve">Implementar la protección CSRF: token </w:t>
             </w:r>
             <w:r>
               <w:rPr>
@@ -17592,14 +17592,14 @@
                 <w:sz w:val="19"/>
                 <w:szCs w:val="19"/>
               </w:rPr>
-              <w:t>X-Requested-With</w:t>
-            </w:r>
-            <w:r>
-              <w:rPr>
-                <w:sz w:val="19"/>
-                <w:szCs w:val="19"/>
-              </w:rPr>
-              <w:t xml:space="preserve"> y verificación del </w:t>
+              <w:t>X-CSRF-Token</w:t>
+            </w:r>
+            <w:r>
+              <w:rPr>
+                <w:sz w:val="19"/>
+                <w:szCs w:val="19"/>
+              </w:rPr>
+              <w:t xml:space="preserve"> firmado con HMAC, cabecera </w:t>
             </w:r>
             <w:r>
               <w:rPr>
@@ -17608,31 +17608,15 @@
                 <w:sz w:val="19"/>
                 <w:szCs w:val="19"/>
               </w:rPr>
-              <w:t>Origin</w:t>
-            </w:r>
-          </w:p>
-        </w:tc>
-        <w:tc>
-          <w:tcPr>
-            <w:tcW w:w="2212" w:type="dxa"/>
-            <w:tcBorders>
-              <w:top w:val="single" w:sz="4" w:space="0" w:color="C3C8D6"/>
-              <w:left w:val="single" w:sz="4" w:space="0" w:color="C3C8D6"/>
-              <w:bottom w:val="single" w:sz="4" w:space="0" w:color="C3C8D6"/>
-              <w:right w:val="single" w:sz="4" w:space="0" w:color="C3C8D6"/>
-            </w:tcBorders>
-            <w:shd w:val="clear" w:color="auto" w:fill="F8F9FC"/>
-            <w:tcMar>
-              <w:top w:w="60" w:type="dxa"/>
-              <w:left w:w="100" w:type="dxa"/>
-              <w:bottom w:w="60" w:type="dxa"/>
-              <w:right w:w="100" w:type="dxa"/>
-            </w:tcMar>
-          </w:tcPr>
-          <w:p>
-            <w:pPr>
-              <w:spacing w:after="40"/>
-            </w:pPr>
+              <w:t>X-Requested-With</w:t>
+            </w:r>
+            <w:r>
+              <w:rPr>
+                <w:sz w:val="19"/>
+                <w:szCs w:val="19"/>
+              </w:rPr>
+              <w:t xml:space="preserve"> y verificación del </w:t>
+            </w:r>
             <w:r>
               <w:rPr>
                 <w:rFonts w:ascii="Consolas" w:eastAsia="Consolas" w:hAnsi="Consolas" w:cs="Consolas"/>
@@ -17640,15 +17624,31 @@
                 <w:sz w:val="19"/>
                 <w:szCs w:val="19"/>
               </w:rPr>
-              <w:t>verificarCsrf</w:t>
-            </w:r>
-            <w:r>
-              <w:rPr>
-                <w:sz w:val="19"/>
-                <w:szCs w:val="19"/>
-              </w:rPr>
-              <w:t xml:space="preserve"> en </w:t>
-            </w:r>
+              <w:t>Origin</w:t>
+            </w:r>
+          </w:p>
+        </w:tc>
+        <w:tc>
+          <w:tcPr>
+            <w:tcW w:w="2212" w:type="dxa"/>
+            <w:tcBorders>
+              <w:top w:val="single" w:sz="4" w:space="0" w:color="C3C8D6"/>
+              <w:left w:val="single" w:sz="4" w:space="0" w:color="C3C8D6"/>
+              <w:bottom w:val="single" w:sz="4" w:space="0" w:color="C3C8D6"/>
+              <w:right w:val="single" w:sz="4" w:space="0" w:color="C3C8D6"/>
+            </w:tcBorders>
+            <w:shd w:val="clear" w:color="auto" w:fill="F8F9FC"/>
+            <w:tcMar>
+              <w:top w:w="60" w:type="dxa"/>
+              <w:left w:w="100" w:type="dxa"/>
+              <w:bottom w:w="60" w:type="dxa"/>
+              <w:right w:w="100" w:type="dxa"/>
+            </w:tcMar>
+          </w:tcPr>
+          <w:p>
+            <w:pPr>
+              <w:spacing w:after="40"/>
+            </w:pPr>
             <w:r>
               <w:rPr>
                 <w:rFonts w:ascii="Consolas" w:eastAsia="Consolas" w:hAnsi="Consolas" w:cs="Consolas"/>
@@ -17656,6 +17656,22 @@
                 <w:sz w:val="19"/>
                 <w:szCs w:val="19"/>
               </w:rPr>
+              <w:t>server/sesion.js</w:t>
+            </w:r>
+            <w:r>
+              <w:rPr>
+                <w:sz w:val="19"/>
+                <w:szCs w:val="19"/>
+              </w:rPr>
+              <w:t xml:space="preserve">, </w:t>
+            </w:r>
+            <w:r>
+              <w:rPr>
+                <w:rFonts w:ascii="Consolas" w:eastAsia="Consolas" w:hAnsi="Consolas" w:cs="Consolas"/>
+                <w:color w:val="1B2233"/>
+                <w:sz w:val="19"/>
+                <w:szCs w:val="19"/>
+              </w:rPr>
               <w:t>server/http.js</w:t>
             </w:r>
           </w:p>
@@ -17686,7 +17702,7 @@
                 <w:sz w:val="19"/>
                 <w:szCs w:val="19"/>
               </w:rPr>
-              <w:t>Una petición desde otro sitio responde 403</w:t>
+              <w:t>Una petición sin token válido o desde otro sitio responde 403</w:t>
             </w:r>
           </w:p>
         </w:tc>
@@ -18104,7 +18120,7 @@
                 <w:sz w:val="19"/>
                 <w:szCs w:val="19"/>
               </w:rPr>
-              <w:t xml:space="preserve"> (22 casos)</w:t>
+              <w:t xml:space="preserve"> (24 casos)</w:t>
             </w:r>
           </w:p>
         </w:tc>
@@ -18296,7 +18312,7 @@
         <w:pStyle w:val="Ttulo1"/>
         <w:pageBreakBefore/>
       </w:pPr>
-      <w:bookmarkStart w:id="8" w:name="_Toc241475900"/>
+      <w:bookmarkStart w:id="8" w:name="_Toc241477597"/>
       <w:r>
         <w:lastRenderedPageBreak/>
         <w:t>B. Justificación de Arquitectura y Patrones</w:t>
@@ -18307,7 +18323,7 @@
       <w:pPr>
         <w:pStyle w:val="Ttulo2"/>
       </w:pPr>
-      <w:bookmarkStart w:id="9" w:name="_Toc241475901"/>
+      <w:bookmarkStart w:id="9" w:name="_Toc241477598"/>
       <w:r>
         <w:t>B.1 Diagrama de arquitectura de software</w:t>
       </w:r>
@@ -18322,7 +18338,7 @@
           <w:noProof/>
         </w:rPr>
         <w:drawing>
-          <wp:inline distT="0" distB="0" distL="0" distR="0" wp14:anchorId="6CD7101A" wp14:editId="1191B713">
+          <wp:inline distT="0" distB="0" distL="0" distR="0" wp14:anchorId="043CE729" wp14:editId="2F7CD3B5">
             <wp:extent cx="5905500" cy="3724275"/>
             <wp:effectExtent l="0" t="0" r="0" b="0"/>
             <wp:docPr id="1" name="Imagen 1"/>
@@ -18494,7 +18510,7 @@
       <w:pPr>
         <w:pStyle w:val="Ttulo2"/>
       </w:pPr>
-      <w:bookmarkStart w:id="10" w:name="_Toc241475902"/>
+      <w:bookmarkStart w:id="10" w:name="_Toc241477599"/>
       <w:r>
         <w:t>B.2 Decisión navegacional: SPA frente a MPA</w:t>
       </w:r>
@@ -18523,7 +18539,7 @@
           <w:left w:w="10" w:type="dxa"/>
           <w:right w:w="10" w:type="dxa"/>
         </w:tblCellMar>
-        <w:tblLook w:val="04A0" w:firstRow="1" w:lastRow="0" w:firstColumn="1" w:lastColumn="0" w:noHBand="0" w:noVBand="1"/>
+        <w:tblLook w:val="0000" w:firstRow="0" w:lastRow="0" w:firstColumn="0" w:lastColumn="0" w:noHBand="0" w:noVBand="0"/>
       </w:tblPr>
       <w:tblGrid>
         <w:gridCol w:w="2246"/>
@@ -19365,7 +19381,7 @@
       <w:pPr>
         <w:pStyle w:val="Ttulo2"/>
       </w:pPr>
-      <w:bookmarkStart w:id="11" w:name="_Toc241475903"/>
+      <w:bookmarkStart w:id="11" w:name="_Toc241477600"/>
       <w:r>
         <w:t>B.3 Estrategia de enrutamiento con History API</w:t>
       </w:r>
@@ -19655,7 +19671,7 @@
           <w:left w:w="10" w:type="dxa"/>
           <w:right w:w="10" w:type="dxa"/>
         </w:tblCellMar>
-        <w:tblLook w:val="04A0" w:firstRow="1" w:lastRow="0" w:firstColumn="1" w:lastColumn="0" w:noHBand="0" w:noVBand="1"/>
+        <w:tblLook w:val="0000" w:firstRow="0" w:lastRow="0" w:firstColumn="0" w:lastColumn="0" w:noHBand="0" w:noVBand="0"/>
       </w:tblPr>
       <w:tblGrid>
         <w:gridCol w:w="2978"/>
@@ -20748,7 +20764,7 @@
       <w:pPr>
         <w:pStyle w:val="Ttulo2"/>
       </w:pPr>
-      <w:bookmarkStart w:id="12" w:name="_Toc241475904"/>
+      <w:bookmarkStart w:id="12" w:name="_Toc241477601"/>
       <w:r>
         <w:t>B.4 Distribución del almacenamiento web</w:t>
       </w:r>
@@ -20769,7 +20785,7 @@
           <w:left w:w="10" w:type="dxa"/>
           <w:right w:w="10" w:type="dxa"/>
         </w:tblCellMar>
-        <w:tblLook w:val="04A0" w:firstRow="1" w:lastRow="0" w:firstColumn="1" w:lastColumn="0" w:noHBand="0" w:noVBand="1"/>
+        <w:tblLook w:val="0000" w:firstRow="0" w:lastRow="0" w:firstColumn="0" w:lastColumn="0" w:noHBand="0" w:noVBand="0"/>
       </w:tblPr>
       <w:tblGrid>
         <w:gridCol w:w="2066"/>
@@ -21623,7 +21639,7 @@
         <w:pStyle w:val="Ttulo1"/>
         <w:pageBreakBefore/>
       </w:pPr>
-      <w:bookmarkStart w:id="13" w:name="_Toc241475905"/>
+      <w:bookmarkStart w:id="13" w:name="_Toc241477602"/>
       <w:r>
         <w:lastRenderedPageBreak/>
         <w:t>C. Análisis de Sistemas e Ingeniería de Requisitos</w:t>
@@ -21634,7 +21650,7 @@
       <w:pPr>
         <w:pStyle w:val="Ttulo2"/>
       </w:pPr>
-      <w:bookmarkStart w:id="14" w:name="_Toc241475906"/>
+      <w:bookmarkStart w:id="14" w:name="_Toc241477603"/>
       <w:r>
         <w:t>C.1 Actores</w:t>
       </w:r>
@@ -21655,7 +21671,7 @@
           <w:left w:w="10" w:type="dxa"/>
           <w:right w:w="10" w:type="dxa"/>
         </w:tblCellMar>
-        <w:tblLook w:val="04A0" w:firstRow="1" w:lastRow="0" w:firstColumn="1" w:lastColumn="0" w:noHBand="0" w:noVBand="1"/>
+        <w:tblLook w:val="0000" w:firstRow="0" w:lastRow="0" w:firstColumn="0" w:lastColumn="0" w:noHBand="0" w:noVBand="0"/>
       </w:tblPr>
       <w:tblGrid>
         <w:gridCol w:w="2340"/>
@@ -22361,7 +22377,7 @@
       <w:pPr>
         <w:pStyle w:val="Ttulo2"/>
       </w:pPr>
-      <w:bookmarkStart w:id="15" w:name="_Toc241475907"/>
+      <w:bookmarkStart w:id="15" w:name="_Toc241477604"/>
       <w:r>
         <w:t>C.2 Diagrama de casos de uso (UML)</w:t>
       </w:r>
@@ -22376,7 +22392,7 @@
           <w:noProof/>
         </w:rPr>
         <w:drawing>
-          <wp:inline distT="0" distB="0" distL="0" distR="0" wp14:anchorId="1E2910AC" wp14:editId="287155E0">
+          <wp:inline distT="0" distB="0" distL="0" distR="0" wp14:anchorId="62D288FD" wp14:editId="41DE41A1">
             <wp:extent cx="5715000" cy="4371975"/>
             <wp:effectExtent l="0" t="0" r="0" b="0"/>
             <wp:docPr id="2" name="Imagen 2"/>
@@ -22435,7 +22451,7 @@
       <w:pPr>
         <w:pStyle w:val="Ttulo2"/>
       </w:pPr>
-      <w:bookmarkStart w:id="16" w:name="_Toc241475908"/>
+      <w:bookmarkStart w:id="16" w:name="_Toc241477605"/>
       <w:r>
         <w:lastRenderedPageBreak/>
         <w:t>C.3 Matriz de casos de uso</w:t>
@@ -22457,7 +22473,7 @@
           <w:left w:w="10" w:type="dxa"/>
           <w:right w:w="10" w:type="dxa"/>
         </w:tblCellMar>
-        <w:tblLook w:val="04A0" w:firstRow="1" w:lastRow="0" w:firstColumn="1" w:lastColumn="0" w:noHBand="0" w:noVBand="1"/>
+        <w:tblLook w:val="0000" w:firstRow="0" w:lastRow="0" w:firstColumn="0" w:lastColumn="0" w:noHBand="0" w:noVBand="0"/>
       </w:tblPr>
       <w:tblGrid>
         <w:gridCol w:w="962"/>
@@ -25172,7 +25188,7 @@
       <w:pPr>
         <w:pStyle w:val="Ttulo2"/>
       </w:pPr>
-      <w:bookmarkStart w:id="17" w:name="_Toc241475909"/>
+      <w:bookmarkStart w:id="17" w:name="_Toc241477606"/>
       <w:r>
         <w:t>C.4 Especificación de los casos de uso principales</w:t>
       </w:r>
@@ -25203,7 +25219,7 @@
           <w:left w:w="10" w:type="dxa"/>
           <w:right w:w="10" w:type="dxa"/>
         </w:tblCellMar>
-        <w:tblLook w:val="04A0" w:firstRow="1" w:lastRow="0" w:firstColumn="1" w:lastColumn="0" w:noHBand="0" w:noVBand="1"/>
+        <w:tblLook w:val="0000" w:firstRow="0" w:lastRow="0" w:firstColumn="0" w:lastColumn="0" w:noHBand="0" w:noVBand="0"/>
       </w:tblPr>
       <w:tblGrid>
         <w:gridCol w:w="2200"/>
@@ -25884,7 +25900,7 @@
           <w:left w:w="10" w:type="dxa"/>
           <w:right w:w="10" w:type="dxa"/>
         </w:tblCellMar>
-        <w:tblLook w:val="04A0" w:firstRow="1" w:lastRow="0" w:firstColumn="1" w:lastColumn="0" w:noHBand="0" w:noVBand="1"/>
+        <w:tblLook w:val="0000" w:firstRow="0" w:lastRow="0" w:firstColumn="0" w:lastColumn="0" w:noHBand="0" w:noVBand="0"/>
       </w:tblPr>
       <w:tblGrid>
         <w:gridCol w:w="2200"/>
@@ -26187,10 +26203,7 @@
               <w:spacing w:after="60"/>
             </w:pPr>
             <w:r>
-              <w:t>Completa datos personales, DPI, departa</w:t>
-            </w:r>
-            <w:r>
-              <w:t>mento, puesto, jefe, fecha de ingreso y salario.</w:t>
+              <w:t>Completa datos personales, DPI, departamento, puesto, jefe, fecha de ingreso y salario.</w:t>
             </w:r>
           </w:p>
           <w:p>
@@ -26241,7 +26254,10 @@
               <w:spacing w:after="60"/>
             </w:pPr>
             <w:r>
-              <w:t>La base de datos asigna el código (EMP-00001…) y registra la operación en la bitácora (JSONB).</w:t>
+              <w:t>La</w:t>
+            </w:r>
+            <w:r>
+              <w:t xml:space="preserve"> base de datos asigna el código (EMP-00001…) y registra la operación en la bitácora (JSONB).</w:t>
             </w:r>
           </w:p>
           <w:p>
@@ -26523,7 +26539,7 @@
           <w:left w:w="10" w:type="dxa"/>
           <w:right w:w="10" w:type="dxa"/>
         </w:tblCellMar>
-        <w:tblLook w:val="04A0" w:firstRow="1" w:lastRow="0" w:firstColumn="1" w:lastColumn="0" w:noHBand="0" w:noVBand="1"/>
+        <w:tblLook w:val="0000" w:firstRow="0" w:lastRow="0" w:firstColumn="0" w:lastColumn="0" w:noHBand="0" w:noVBand="0"/>
       </w:tblPr>
       <w:tblGrid>
         <w:gridCol w:w="2200"/>
@@ -27082,7 +27098,7 @@
           <w:left w:w="10" w:type="dxa"/>
           <w:right w:w="10" w:type="dxa"/>
         </w:tblCellMar>
-        <w:tblLook w:val="04A0" w:firstRow="1" w:lastRow="0" w:firstColumn="1" w:lastColumn="0" w:noHBand="0" w:noVBand="1"/>
+        <w:tblLook w:val="0000" w:firstRow="0" w:lastRow="0" w:firstColumn="0" w:lastColumn="0" w:noHBand="0" w:noVBand="0"/>
       </w:tblPr>
       <w:tblGrid>
         <w:gridCol w:w="2200"/>
@@ -27373,10 +27389,7 @@
               <w:spacing w:after="60"/>
             </w:pPr>
             <w:r>
-              <w:t>Indica</w:t>
-            </w:r>
-            <w:r>
-              <w:t xml:space="preserve"> tipo, fechas, días y motivo; la SPA envía </w:t>
+              <w:t xml:space="preserve">Indica tipo, fechas, días y motivo; la SPA envía </w:t>
             </w:r>
             <w:r>
               <w:rPr>
@@ -27414,7 +27427,10 @@
               <w:spacing w:after="60"/>
             </w:pPr>
             <w:r>
-              <w:t>El jefe ve la solicitud en «Vacaciones y permisos» (RLS le muestra solo a su equipo).</w:t>
+              <w:t>El jefe ve la solicitud en «Vac</w:t>
+            </w:r>
+            <w:r>
+              <w:t>aciones y permisos» (RLS le muestra solo a su equipo).</w:t>
             </w:r>
           </w:p>
           <w:p>
@@ -27649,7 +27665,7 @@
           <w:left w:w="10" w:type="dxa"/>
           <w:right w:w="10" w:type="dxa"/>
         </w:tblCellMar>
-        <w:tblLook w:val="04A0" w:firstRow="1" w:lastRow="0" w:firstColumn="1" w:lastColumn="0" w:noHBand="0" w:noVBand="1"/>
+        <w:tblLook w:val="0000" w:firstRow="0" w:lastRow="0" w:firstColumn="0" w:lastColumn="0" w:noHBand="0" w:noVBand="0"/>
       </w:tblPr>
       <w:tblGrid>
         <w:gridCol w:w="2200"/>
@@ -28227,7 +28243,7 @@
           <w:left w:w="10" w:type="dxa"/>
           <w:right w:w="10" w:type="dxa"/>
         </w:tblCellMar>
-        <w:tblLook w:val="04A0" w:firstRow="1" w:lastRow="0" w:firstColumn="1" w:lastColumn="0" w:noHBand="0" w:noVBand="1"/>
+        <w:tblLook w:val="0000" w:firstRow="0" w:lastRow="0" w:firstColumn="0" w:lastColumn="0" w:noHBand="0" w:noVBand="0"/>
       </w:tblPr>
       <w:tblGrid>
         <w:gridCol w:w="2200"/>
@@ -28555,7 +28571,10 @@
               <w:spacing w:after="60"/>
             </w:pPr>
             <w:r>
-              <w:t>En el último paso adjunta su CV en PDF y acepta el tratamiento de datos personales.</w:t>
+              <w:t xml:space="preserve">En el último paso </w:t>
+            </w:r>
+            <w:r>
+              <w:t>adjunta su CV en PDF y acepta el tratamiento de datos personales.</w:t>
             </w:r>
           </w:p>
           <w:p>
@@ -28593,10 +28612,10 @@
               <w:spacing w:after="60"/>
             </w:pPr>
             <w:r>
-              <w:t>La API valida lo</w:t>
-            </w:r>
-            <w:r>
-              <w:t>s datos, comprueba que el archivo sea un PDF real, aplica el límite de envíos por IP y guarda postulante, CV y postulación.</w:t>
+              <w:t>La API valida los datos, comprueba que el archivo sea un PDF real, aplica el límite de envíos por IP y guarda postulante, CV y po</w:t>
+            </w:r>
+            <w:r>
+              <w:t>stulación.</w:t>
             </w:r>
           </w:p>
           <w:p>
@@ -28746,10 +28765,7 @@
               <w:t>5c.</w:t>
             </w:r>
             <w:r>
-              <w:t xml:space="preserve"> Ya había postulado a la misma vacante: se informa</w:t>
-            </w:r>
-            <w:r>
-              <w:t xml:space="preserve"> sin duplicar el registro.</w:t>
+              <w:t xml:space="preserve"> Ya había postulado a la misma vacante: se informa sin duplicar el registro.</w:t>
             </w:r>
           </w:p>
         </w:tc>
@@ -28819,7 +28835,14 @@
                 <w:sz w:val="19"/>
                 <w:szCs w:val="19"/>
               </w:rPr>
-              <w:t>La postulación aparece en la etapa «Aplicó» del proceso de selección con su CV.</w:t>
+              <w:t>La postulación aparece en la et</w:t>
+            </w:r>
+            <w:r>
+              <w:rPr>
+                <w:sz w:val="19"/>
+                <w:szCs w:val="19"/>
+              </w:rPr>
+              <w:t>apa «Aplicó» del proceso de selección con su CV.</w:t>
             </w:r>
           </w:p>
         </w:tc>
@@ -28835,7 +28858,7 @@
         <w:pStyle w:val="Ttulo1"/>
         <w:pageBreakBefore/>
       </w:pPr>
-      <w:bookmarkStart w:id="18" w:name="_Toc241475910"/>
+      <w:bookmarkStart w:id="18" w:name="_Toc241477607"/>
       <w:r>
         <w:lastRenderedPageBreak/>
         <w:t>D. Diseño de Base de Datos Híbrida (PostgreSQL en Supabase)</w:t>
@@ -28846,7 +28869,7 @@
       <w:pPr>
         <w:pStyle w:val="Ttulo2"/>
       </w:pPr>
-      <w:bookmarkStart w:id="19" w:name="_Toc241475911"/>
+      <w:bookmarkStart w:id="19" w:name="_Toc241477608"/>
       <w:r>
         <w:t>D.1 Visión general</w:t>
       </w:r>
@@ -28890,16 +28913,7 @@
           <w:sz w:val="19"/>
           <w:szCs w:val="19"/>
         </w:rPr>
-        <w:t>reclutami</w:t>
-      </w:r>
-      <w:r>
-        <w:rPr>
-          <w:rFonts w:ascii="Consolas" w:eastAsia="Consolas" w:hAnsi="Consolas" w:cs="Consolas"/>
-          <w:color w:val="1B2233"/>
-          <w:sz w:val="19"/>
-          <w:szCs w:val="19"/>
-        </w:rPr>
-        <w:t>ento</w:t>
+        <w:t>reclutamiento</w:t>
       </w:r>
       <w:r>
         <w:t xml:space="preserve"> (9) y </w:t>
@@ -28914,7 +28928,10 @@
         <w:t>public</w:t>
       </w:r>
       <w:r>
-        <w:t xml:space="preserve"> (1, perfiles de usuario). Supera el mínimo de 10 entidades.</w:t>
+        <w:t xml:space="preserve"> (1, perfiles de usuario). Supera el mínimo de 10 entidade</w:t>
+      </w:r>
+      <w:r>
+        <w:t>s.</w:t>
       </w:r>
     </w:p>
     <w:p>
@@ -29019,10 +29036,10 @@
           <w:b/>
           <w:bCs/>
         </w:rPr>
-        <w:t>58 políticas RLS</w:t>
+        <w:t>57 políticas RLS</w:t>
       </w:r>
       <w:r>
-        <w:t xml:space="preserve"> activas; todas las tablas tienen RLS habilitado.</w:t>
+        <w:t xml:space="preserve"> activas (55 en las 24 tablas y 2 en Storage); todas las tablas tienen RLS habilitado y al menos una política.</w:t>
       </w:r>
     </w:p>
     <w:p>
@@ -29042,10 +29059,10 @@
         <w:t>Integridad:</w:t>
       </w:r>
       <w:r>
-        <w:t xml:space="preserve"> restricciones CHECK (estados, tipos, DPI de 13 dígitos, calificac</w:t>
+        <w:t xml:space="preserve"> restricciones CHECK (estados, tipos, DPI de 13 dígitos, calificaciones 1–5, fechas coherentes), U</w:t>
       </w:r>
       <w:r>
-        <w:t xml:space="preserve">iones 1–5, fechas coherentes), UNIQUE (DPI, código de empleado, empleado por período) y triggers (bitácora, </w:t>
+        <w:t xml:space="preserve">NIQUE (DPI, código de empleado, empleado por período) y triggers (bitácora, </w:t>
       </w:r>
       <w:r>
         <w:rPr>
@@ -29064,7 +29081,7 @@
       <w:pPr>
         <w:pStyle w:val="Ttulo2"/>
       </w:pPr>
-      <w:bookmarkStart w:id="20" w:name="_Toc241475912"/>
+      <w:bookmarkStart w:id="20" w:name="_Toc241477609"/>
       <w:r>
         <w:t>D.2 Diagrama entidad-relación — esquema «empresa»</w:t>
       </w:r>
@@ -29079,7 +29096,7 @@
           <w:noProof/>
         </w:rPr>
         <w:drawing>
-          <wp:inline distT="0" distB="0" distL="0" distR="0" wp14:anchorId="1EF83F7B" wp14:editId="34A801A4">
+          <wp:inline distT="0" distB="0" distL="0" distR="0" wp14:anchorId="068890AA" wp14:editId="40226EB3">
             <wp:extent cx="5905500" cy="4695825"/>
             <wp:effectExtent l="0" t="0" r="0" b="0"/>
             <wp:docPr id="3" name="Imagen 3"/>
@@ -29131,24 +29148,14 @@
           <w:sz w:val="18"/>
           <w:szCs w:val="18"/>
         </w:rPr>
-        <w:t>Figura 3. DER del esquema empresa (más public.perfile</w:t>
-      </w:r>
-      <w:r>
-        <w:rPr>
-          <w:i/>
-          <w:iCs/>
-          <w:color w:val="5D6680"/>
-          <w:sz w:val="18"/>
-          <w:szCs w:val="18"/>
-        </w:rPr>
-        <w:t>s).</w:t>
+        <w:t>Figura 3. DER del esquema empresa (más public.perfiles).</w:t>
       </w:r>
     </w:p>
     <w:p>
       <w:pPr>
         <w:pStyle w:val="Ttulo2"/>
       </w:pPr>
-      <w:bookmarkStart w:id="21" w:name="_Toc241475913"/>
+      <w:bookmarkStart w:id="21" w:name="_Toc241477610"/>
       <w:r>
         <w:lastRenderedPageBreak/>
         <w:t>D.3 Diagrama entidad-relación — esquema «reclutamiento»</w:t>
@@ -29164,7 +29171,7 @@
           <w:noProof/>
         </w:rPr>
         <w:drawing>
-          <wp:inline distT="0" distB="0" distL="0" distR="0" wp14:anchorId="2C53ADA5" wp14:editId="21396E35">
+          <wp:inline distT="0" distB="0" distL="0" distR="0" wp14:anchorId="03FD9190" wp14:editId="31C5EE32">
             <wp:extent cx="5905500" cy="4095750"/>
             <wp:effectExtent l="0" t="0" r="0" b="0"/>
             <wp:docPr id="4" name="Imagen 4"/>
@@ -29223,7 +29230,7 @@
       <w:pPr>
         <w:pStyle w:val="Ttulo2"/>
       </w:pPr>
-      <w:bookmarkStart w:id="22" w:name="_Toc241475914"/>
+      <w:bookmarkStart w:id="22" w:name="_Toc241477611"/>
       <w:r>
         <w:t>D.4 Diccionario de entidades</w:t>
       </w:r>
@@ -29244,7 +29251,7 @@
           <w:left w:w="10" w:type="dxa"/>
           <w:right w:w="10" w:type="dxa"/>
         </w:tblCellMar>
-        <w:tblLook w:val="04A0" w:firstRow="1" w:lastRow="0" w:firstColumn="1" w:lastColumn="0" w:noHBand="0" w:noVBand="1"/>
+        <w:tblLook w:val="0000" w:firstRow="0" w:lastRow="0" w:firstColumn="0" w:lastColumn="0" w:noHBand="0" w:noVBand="0"/>
       </w:tblPr>
       <w:tblGrid>
         <w:gridCol w:w="1309"/>
@@ -33172,7 +33179,7 @@
       <w:pPr>
         <w:pStyle w:val="Ttulo2"/>
       </w:pPr>
-      <w:bookmarkStart w:id="23" w:name="_Toc241475915"/>
+      <w:bookmarkStart w:id="23" w:name="_Toc241477612"/>
       <w:r>
         <w:t>D.5 Normalización (3FN)</w:t>
       </w:r>
@@ -33331,17 +33338,17 @@
         <w:t>liquidaciones.salario_base</w:t>
       </w:r>
       <w:r>
-        <w:t xml:space="preserve"> guardan el salario vigente en el momento del cálculo, porque un documento de pago debe conservar sus valores</w:t>
+        <w:t xml:space="preserve"> guardan el salario vigente en el momento del cálculo, porque un documento de pa</w:t>
       </w:r>
       <w:r>
-        <w:t xml:space="preserve"> históricos aunque el salario del empleado cambie después.</w:t>
+        <w:t>go debe conservar sus valores históricos aunque el salario del empleado cambie después.</w:t>
       </w:r>
     </w:p>
     <w:p>
       <w:pPr>
         <w:pStyle w:val="Ttulo2"/>
       </w:pPr>
-      <w:bookmarkStart w:id="24" w:name="_Toc241475916"/>
+      <w:bookmarkStart w:id="24" w:name="_Toc241477613"/>
       <w:r>
         <w:t>D.6 Esquema NoSQL / JSONB</w:t>
       </w:r>
@@ -33370,7 +33377,7 @@
           <w:left w:w="10" w:type="dxa"/>
           <w:right w:w="10" w:type="dxa"/>
         </w:tblCellMar>
-        <w:tblLook w:val="04A0" w:firstRow="1" w:lastRow="0" w:firstColumn="1" w:lastColumn="0" w:noHBand="0" w:noVBand="1"/>
+        <w:tblLook w:val="0000" w:firstRow="0" w:lastRow="0" w:firstColumn="0" w:lastColumn="0" w:noHBand="0" w:noVBand="0"/>
       </w:tblPr>
       <w:tblGrid>
         <w:gridCol w:w="2808"/>
@@ -33827,6 +33834,8 @@
     </w:p>
     <w:p>
       <w:pPr>
+        <w:keepNext/>
+        <w:keepLines/>
         <w:shd w:val="clear" w:color="auto" w:fill="F4F6FB"/>
         <w:ind w:left="200" w:right="200"/>
       </w:pPr>
@@ -33841,6 +33850,8 @@
     </w:p>
     <w:p>
       <w:pPr>
+        <w:keepNext/>
+        <w:keepLines/>
         <w:shd w:val="clear" w:color="auto" w:fill="F4F6FB"/>
         <w:ind w:left="200" w:right="200"/>
       </w:pPr>
@@ -33855,6 +33866,8 @@
     </w:p>
     <w:p>
       <w:pPr>
+        <w:keepNext/>
+        <w:keepLines/>
         <w:shd w:val="clear" w:color="auto" w:fill="F4F6FB"/>
         <w:ind w:left="200" w:right="200"/>
       </w:pPr>
@@ -33869,6 +33882,8 @@
     </w:p>
     <w:p>
       <w:pPr>
+        <w:keepNext/>
+        <w:keepLines/>
         <w:shd w:val="clear" w:color="auto" w:fill="F4F6FB"/>
         <w:ind w:left="200" w:right="200"/>
       </w:pPr>
@@ -33883,6 +33898,8 @@
     </w:p>
     <w:p>
       <w:pPr>
+        <w:keepNext/>
+        <w:keepLines/>
         <w:shd w:val="clear" w:color="auto" w:fill="F4F6FB"/>
         <w:ind w:left="200" w:right="200"/>
       </w:pPr>
@@ -33897,6 +33914,8 @@
     </w:p>
     <w:p>
       <w:pPr>
+        <w:keepNext/>
+        <w:keepLines/>
         <w:shd w:val="clear" w:color="auto" w:fill="F4F6FB"/>
         <w:ind w:left="200" w:right="200"/>
       </w:pPr>
@@ -33919,6 +33938,7 @@
     </w:p>
     <w:p>
       <w:pPr>
+        <w:keepLines/>
         <w:shd w:val="clear" w:color="auto" w:fill="F4F6FB"/>
         <w:spacing w:after="160"/>
         <w:ind w:left="200" w:right="200"/>
@@ -33944,6 +33964,8 @@
     </w:p>
     <w:p>
       <w:pPr>
+        <w:keepNext/>
+        <w:keepLines/>
         <w:shd w:val="clear" w:color="auto" w:fill="F4F6FB"/>
         <w:ind w:left="200" w:right="200"/>
       </w:pPr>
@@ -33958,6 +33980,8 @@
     </w:p>
     <w:p>
       <w:pPr>
+        <w:keepNext/>
+        <w:keepLines/>
         <w:shd w:val="clear" w:color="auto" w:fill="F4F6FB"/>
         <w:ind w:left="200" w:right="200"/>
       </w:pPr>
@@ -33972,6 +33996,8 @@
     </w:p>
     <w:p>
       <w:pPr>
+        <w:keepNext/>
+        <w:keepLines/>
         <w:shd w:val="clear" w:color="auto" w:fill="F4F6FB"/>
         <w:ind w:left="200" w:right="200"/>
       </w:pPr>
@@ -33986,6 +34012,8 @@
     </w:p>
     <w:p>
       <w:pPr>
+        <w:keepNext/>
+        <w:keepLines/>
         <w:shd w:val="clear" w:color="auto" w:fill="F4F6FB"/>
         <w:ind w:left="200" w:right="200"/>
       </w:pPr>
@@ -34000,6 +34028,8 @@
     </w:p>
     <w:p>
       <w:pPr>
+        <w:keepNext/>
+        <w:keepLines/>
         <w:shd w:val="clear" w:color="auto" w:fill="F4F6FB"/>
         <w:ind w:left="200" w:right="200"/>
       </w:pPr>
@@ -34014,6 +34044,7 @@
     </w:p>
     <w:p>
       <w:pPr>
+        <w:keepLines/>
         <w:shd w:val="clear" w:color="auto" w:fill="F4F6FB"/>
         <w:spacing w:after="160"/>
         <w:ind w:left="200" w:right="200"/>
@@ -34042,11 +34073,14 @@
         <w:keepLines/>
       </w:pPr>
       <w:r>
+        <w:lastRenderedPageBreak/>
         <w:t>Consultas JSONB que ejecuta el backend (SQL directo)</w:t>
       </w:r>
     </w:p>
     <w:p>
       <w:pPr>
+        <w:keepNext/>
+        <w:keepLines/>
         <w:shd w:val="clear" w:color="auto" w:fill="F4F6FB"/>
         <w:ind w:left="200" w:right="200"/>
       </w:pPr>
@@ -34061,6 +34095,8 @@
     </w:p>
     <w:p>
       <w:pPr>
+        <w:keepNext/>
+        <w:keepLines/>
         <w:shd w:val="clear" w:color="auto" w:fill="F4F6FB"/>
         <w:ind w:left="200" w:right="200"/>
       </w:pPr>
@@ -34075,6 +34111,8 @@
     </w:p>
     <w:p>
       <w:pPr>
+        <w:keepNext/>
+        <w:keepLines/>
         <w:shd w:val="clear" w:color="auto" w:fill="F4F6FB"/>
         <w:ind w:left="200" w:right="200"/>
       </w:pPr>
@@ -34089,6 +34127,8 @@
     </w:p>
     <w:p>
       <w:pPr>
+        <w:keepNext/>
+        <w:keepLines/>
         <w:shd w:val="clear" w:color="auto" w:fill="F4F6FB"/>
         <w:ind w:left="200" w:right="200"/>
       </w:pPr>
@@ -34103,6 +34143,8 @@
     </w:p>
     <w:p>
       <w:pPr>
+        <w:keepNext/>
+        <w:keepLines/>
         <w:shd w:val="clear" w:color="auto" w:fill="F4F6FB"/>
         <w:ind w:left="200" w:right="200"/>
       </w:pPr>
@@ -34117,6 +34159,8 @@
     </w:p>
     <w:p>
       <w:pPr>
+        <w:keepNext/>
+        <w:keepLines/>
         <w:shd w:val="clear" w:color="auto" w:fill="F4F6FB"/>
         <w:ind w:left="200" w:right="200"/>
       </w:pPr>
@@ -34131,6 +34175,7 @@
     </w:p>
     <w:p>
       <w:pPr>
+        <w:keepLines/>
         <w:shd w:val="clear" w:color="auto" w:fill="F4F6FB"/>
         <w:spacing w:after="160"/>
         <w:ind w:left="200" w:right="200"/>
@@ -34141,7 +34186,6 @@
           <w:sz w:val="17"/>
           <w:szCs w:val="17"/>
         </w:rPr>
-        <w:lastRenderedPageBreak/>
         <w:t xml:space="preserve"> where antes -&gt; k is distinct from despues -&gt; k;</w:t>
       </w:r>
     </w:p>
@@ -34149,9 +34193,12 @@
       <w:pPr>
         <w:pStyle w:val="Ttulo2"/>
       </w:pPr>
-      <w:bookmarkStart w:id="25" w:name="_Toc241475917"/>
+      <w:bookmarkStart w:id="25" w:name="_Toc241477614"/>
       <w:r>
-        <w:t>D.7 Políticas de seguridad (Row Level Security)</w:t>
+        <w:t xml:space="preserve">D.7 Políticas de seguridad </w:t>
+      </w:r>
+      <w:r>
+        <w:t>(Row Level Security)</w:t>
       </w:r>
       <w:bookmarkEnd w:id="25"/>
     </w:p>
@@ -34160,10 +34207,7 @@
         <w:spacing w:after="120" w:line="276" w:lineRule="auto"/>
       </w:pPr>
       <w:r>
-        <w:t>Las políticas usan tres funciones auxiliare</w:t>
-      </w:r>
-      <w:r>
-        <w:t xml:space="preserve">s </w:t>
+        <w:t xml:space="preserve">Las políticas usan tres funciones auxiliares </w:t>
       </w:r>
       <w:r>
         <w:rPr>
@@ -34243,7 +34287,10 @@
         <w:t>public.empleado_actual()</w:t>
       </w:r>
       <w:r>
-        <w:t>: devuelve el id del expediente vinculado al usuario.</w:t>
+        <w:t xml:space="preserve">: devuelve el </w:t>
+      </w:r>
+      <w:r>
+        <w:t>id del expediente vinculado al usuario.</w:t>
       </w:r>
     </w:p>
     <w:p>
@@ -34262,16 +34309,7 @@
           <w:sz w:val="19"/>
           <w:szCs w:val="19"/>
         </w:rPr>
-        <w:t>empresa.es_de_mi_equipo(</w:t>
-      </w:r>
-      <w:r>
-        <w:rPr>
-          <w:rFonts w:ascii="Consolas" w:eastAsia="Consolas" w:hAnsi="Consolas" w:cs="Consolas"/>
-          <w:color w:val="1B2233"/>
-          <w:sz w:val="19"/>
-          <w:szCs w:val="19"/>
-        </w:rPr>
-        <w:t>empleado)</w:t>
+        <w:t>empresa.es_de_mi_equipo(empleado)</w:t>
       </w:r>
       <w:r>
         <w:t xml:space="preserve"> y </w:t>
@@ -34304,7 +34342,7 @@
           <w:left w:w="10" w:type="dxa"/>
           <w:right w:w="10" w:type="dxa"/>
         </w:tblCellMar>
-        <w:tblLook w:val="04A0" w:firstRow="1" w:lastRow="0" w:firstColumn="1" w:lastColumn="0" w:noHBand="0" w:noVBand="1"/>
+        <w:tblLook w:val="0000" w:firstRow="0" w:lastRow="0" w:firstColumn="0" w:lastColumn="0" w:noHBand="0" w:noVBand="0"/>
       </w:tblPr>
       <w:tblGrid>
         <w:gridCol w:w="2755"/>
@@ -36267,6 +36305,7 @@
                 <w:sz w:val="19"/>
                 <w:szCs w:val="19"/>
               </w:rPr>
+              <w:lastRenderedPageBreak/>
               <w:t>empresa.documentos_empleado</w:t>
             </w:r>
           </w:p>
@@ -36519,7 +36558,6 @@
                 <w:sz w:val="19"/>
                 <w:szCs w:val="19"/>
               </w:rPr>
-              <w:lastRenderedPageBreak/>
               <w:t>empresa.periodos_nomina</w:t>
             </w:r>
           </w:p>
@@ -37809,7 +37847,7 @@
                 <w:sz w:val="19"/>
                 <w:szCs w:val="19"/>
               </w:rPr>
-              <w:t>(sin políticas)</w:t>
+              <w:t>nadie_acceso (restrictiva)</w:t>
             </w:r>
           </w:p>
         </w:tc>
@@ -37838,7 +37876,7 @@
                 <w:sz w:val="19"/>
                 <w:szCs w:val="19"/>
               </w:rPr>
-              <w:t>—</w:t>
+              <w:t>ALL</w:t>
             </w:r>
           </w:p>
         </w:tc>
@@ -37867,7 +37905,7 @@
                 <w:sz w:val="19"/>
                 <w:szCs w:val="19"/>
               </w:rPr>
-              <w:t>RLS activo sin políticas: solo el backend (service_role) accede</w:t>
+              <w:t>Niega todo a anon y authenticated; solo el backend (service_role) accede</w:t>
             </w:r>
           </w:p>
         </w:tc>
@@ -38153,7 +38191,7 @@
         <w:pStyle w:val="Ttulo1"/>
         <w:pageBreakBefore/>
       </w:pPr>
-      <w:bookmarkStart w:id="26" w:name="_Toc241475918"/>
+      <w:bookmarkStart w:id="26" w:name="_Toc241477615"/>
       <w:r>
         <w:lastRenderedPageBreak/>
         <w:t>E. Especificación de la API REST (Contrato de Interfaz)</w:t>
@@ -38164,7 +38202,7 @@
       <w:pPr>
         <w:pStyle w:val="Ttulo2"/>
       </w:pPr>
-      <w:bookmarkStart w:id="27" w:name="_Toc241475919"/>
+      <w:bookmarkStart w:id="27" w:name="_Toc241477616"/>
       <w:r>
         <w:t>E.1 Convenciones</w:t>
       </w:r>
@@ -38269,7 +38307,7 @@
           <w:b/>
           <w:bCs/>
         </w:rPr>
-        <w:t>Autenticación:</w:t>
+        <w:t>Autenticación (navegador):</w:t>
       </w:r>
       <w:r>
         <w:t xml:space="preserve"> cookie HttpOnly </w:t>
@@ -38284,7 +38322,7 @@
         <w:t>rrhh_at</w:t>
       </w:r>
       <w:r>
-        <w:t xml:space="preserve"> con el JWT; el navegador la envía automáticamente. No se usa la cabecera Authorization desde el cliente para que JavaScript nunca manipule el token.</w:t>
+        <w:t xml:space="preserve"> con el JWT; el navegador la envía automáticamente y JavaScript nunca manipula el token.</w:t>
       </w:r>
     </w:p>
     <w:p>
@@ -38301,13 +38339,45 @@
           <w:b/>
           <w:bCs/>
         </w:rPr>
-        <w:t>Cabecera anti-CSRF:</w:t>
+        <w:t>Autenticación (otros clientes):</w:t>
       </w:r>
       <w:r>
-        <w:t xml:space="preserve"> toda petición que modifica da</w:t>
+        <w:t xml:space="preserve"> la API también acepta </w:t>
       </w:r>
       <w:r>
-        <w:t xml:space="preserve">tos (POST, PUT, DELETE) debe incluir </w:t>
+        <w:rPr>
+          <w:rFonts w:ascii="Consolas" w:eastAsia="Consolas" w:hAnsi="Consolas" w:cs="Consolas"/>
+          <w:color w:val="1B2233"/>
+          <w:sz w:val="19"/>
+          <w:szCs w:val="19"/>
+        </w:rPr>
+        <w:t>Authorization: Bearer &lt;JWT&gt;</w:t>
+      </w:r>
+      <w:r>
+        <w:t xml:space="preserve"> (por ejemplo, de</w:t>
+      </w:r>
+      <w:r>
+        <w:t>sde Postman o curl). Como esa cabecera no la adjunta el navegador por sí solo, en ese caso no se exige el token CSRF.</w:t>
+      </w:r>
+    </w:p>
+    <w:p>
+      <w:pPr>
+        <w:pStyle w:val="Prrafodelista"/>
+        <w:numPr>
+          <w:ilvl w:val="0"/>
+          <w:numId w:val="2"/>
+        </w:numPr>
+        <w:spacing w:after="60"/>
+      </w:pPr>
+      <w:r>
+        <w:rPr>
+          <w:b/>
+          <w:bCs/>
+        </w:rPr>
+        <w:t>Cabeceras anti-CSRF:</w:t>
+      </w:r>
+      <w:r>
+        <w:t xml:space="preserve"> toda petición que modifica datos (POST, PUT, DELETE) debe incluir </w:t>
       </w:r>
       <w:r>
         <w:rPr>
@@ -38319,7 +38389,78 @@
         <w:t>X-Requested-With: fetch</w:t>
       </w:r>
       <w:r>
+        <w:t>; si usa la cookie de sesión</w:t>
+      </w:r>
+      <w:r>
+        <w:t xml:space="preserve">, además </w:t>
+      </w:r>
+      <w:r>
+        <w:rPr>
+          <w:rFonts w:ascii="Consolas" w:eastAsia="Consolas" w:hAnsi="Consolas" w:cs="Consolas"/>
+          <w:color w:val="1B2233"/>
+          <w:sz w:val="19"/>
+          <w:szCs w:val="19"/>
+        </w:rPr>
+        <w:t>X-CSRF-Token</w:t>
+      </w:r>
+      <w:r>
+        <w:t xml:space="preserve"> con el valor que entregan </w:t>
+      </w:r>
+      <w:r>
+        <w:rPr>
+          <w:rFonts w:ascii="Consolas" w:eastAsia="Consolas" w:hAnsi="Consolas" w:cs="Consolas"/>
+          <w:color w:val="1B2233"/>
+          <w:sz w:val="19"/>
+          <w:szCs w:val="19"/>
+        </w:rPr>
+        <w:t>/auth/login</w:t>
+      </w:r>
+      <w:r>
+        <w:t xml:space="preserve"> y </w:t>
+      </w:r>
+      <w:r>
+        <w:rPr>
+          <w:rFonts w:ascii="Consolas" w:eastAsia="Consolas" w:hAnsi="Consolas" w:cs="Consolas"/>
+          <w:color w:val="1B2233"/>
+          <w:sz w:val="19"/>
+          <w:szCs w:val="19"/>
+        </w:rPr>
+        <w:t>/auth/sesion</w:t>
+      </w:r>
+      <w:r>
         <w:t>.</w:t>
+      </w:r>
+    </w:p>
+    <w:p>
+      <w:pPr>
+        <w:pStyle w:val="Prrafodelista"/>
+        <w:numPr>
+          <w:ilvl w:val="0"/>
+          <w:numId w:val="2"/>
+        </w:numPr>
+        <w:spacing w:after="60"/>
+      </w:pPr>
+      <w:r>
+        <w:rPr>
+          <w:b/>
+          <w:bCs/>
+        </w:rPr>
+        <w:t>Cabecera Content-Type:</w:t>
+      </w:r>
+      <w:r>
+        <w:t xml:space="preserve"> </w:t>
+      </w:r>
+      <w:r>
+        <w:rPr>
+          <w:rFonts w:ascii="Consolas" w:eastAsia="Consolas" w:hAnsi="Consolas" w:cs="Consolas"/>
+          <w:color w:val="1B2233"/>
+          <w:sz w:val="19"/>
+          <w:szCs w:val="19"/>
+        </w:rPr>
+        <w:t>application/json</w:t>
+      </w:r>
+      <w:r>
+        <w:t xml:space="preserve"> en los cuerpos JSON; si falta o es otra, la API responde 400.</w:t>
       </w:r>
     </w:p>
     <w:p>
@@ -38348,7 +38489,7 @@
           <w:sz w:val="19"/>
           <w:szCs w:val="19"/>
         </w:rPr>
-        <w:t>departamentos, puestos, empleados, contratos, ausencias, evaluaciones, documentos_empleado, parametros_nomina, periodos_nomina, recibos_nomina, liquidaciones, configuracion, constancia</w:t>
+        <w:t>departamentos, puestos, empleados, contratos, ausencias, evaluacione</w:t>
       </w:r>
       <w:r>
         <w:rPr>
@@ -38357,10 +38498,13 @@
           <w:sz w:val="19"/>
           <w:szCs w:val="19"/>
         </w:rPr>
-        <w:t>s, auditoria, vacantes, postulantes, educacion, experiencia, referencias, antecedentes, postulaciones, entrevistas, perfiles</w:t>
+        <w:t>s, documentos_empleado, parametros_nomina, periodos_nomina, recibos_nomina, liquidaciones, configuracion, constancias, auditoria, vacantes, postulantes, educacion, experiencia, referencias, antecedentes, postulaciones, entrevistas, perfiles</w:t>
       </w:r>
       <w:r>
-        <w:t xml:space="preserve"> (lista blanca; cada uno con sus métodos permitidos).</w:t>
+        <w:t xml:space="preserve"> (lista blanca; </w:t>
+      </w:r>
+      <w:r>
+        <w:t>cada uno con sus métodos permitidos).</w:t>
       </w:r>
     </w:p>
     <w:p>
@@ -38404,17 +38548,14 @@
         <w:t>[columna, operador, valor]</w:t>
       </w:r>
       <w:r>
-        <w:t xml:space="preserve">. </w:t>
-      </w:r>
-      <w:r>
-        <w:t>Operadores permitidos: eq, neq, gt, gte, lt, lte, in, ilike, is, or.</w:t>
+        <w:t>. Operadores permitidos: eq, neq, gt, gte, lt, lte, in, ilike, is, or.</w:t>
       </w:r>
     </w:p>
     <w:p>
       <w:pPr>
         <w:pStyle w:val="Ttulo2"/>
       </w:pPr>
-      <w:bookmarkStart w:id="28" w:name="_Toc241475920"/>
+      <w:bookmarkStart w:id="28" w:name="_Toc241477617"/>
       <w:r>
         <w:t>E.2 Códigos de respuesta</w:t>
       </w:r>
@@ -38435,7 +38576,7 @@
           <w:left w:w="10" w:type="dxa"/>
           <w:right w:w="10" w:type="dxa"/>
         </w:tblCellMar>
-        <w:tblLook w:val="04A0" w:firstRow="1" w:lastRow="0" w:firstColumn="1" w:lastColumn="0" w:noHBand="0" w:noVBand="1"/>
+        <w:tblLook w:val="0000" w:firstRow="0" w:lastRow="0" w:firstColumn="0" w:lastColumn="0" w:noHBand="0" w:noVBand="0"/>
       </w:tblPr>
       <w:tblGrid>
         <w:gridCol w:w="2808"/>
@@ -39264,8 +39405,9 @@
       <w:pPr>
         <w:pStyle w:val="Ttulo2"/>
       </w:pPr>
-      <w:bookmarkStart w:id="29" w:name="_Toc241475921"/>
+      <w:bookmarkStart w:id="29" w:name="_Toc241477618"/>
       <w:r>
+        <w:lastRenderedPageBreak/>
         <w:t>E.3 Matriz de endpoints</w:t>
       </w:r>
       <w:bookmarkEnd w:id="29"/>
@@ -39285,7 +39427,7 @@
           <w:left w:w="10" w:type="dxa"/>
           <w:right w:w="10" w:type="dxa"/>
         </w:tblCellMar>
-        <w:tblLook w:val="04A0" w:firstRow="1" w:lastRow="0" w:firstColumn="1" w:lastColumn="0" w:noHBand="0" w:noVBand="1"/>
+        <w:tblLook w:val="0000" w:firstRow="0" w:lastRow="0" w:firstColumn="0" w:lastColumn="0" w:noHBand="0" w:noVBand="0"/>
       </w:tblPr>
       <w:tblGrid>
         <w:gridCol w:w="868"/>
@@ -39618,7 +39760,7 @@
                 <w:sz w:val="19"/>
                 <w:szCs w:val="19"/>
               </w:rPr>
-              <w:t>200 perfil + cookies · 400 · 401 · 403</w:t>
+              <w:t>200 perfil + csrf + cookies · 400 · 401 · 403</w:t>
             </w:r>
           </w:p>
         </w:tc>
@@ -39656,7 +39798,6 @@
                 <w:sz w:val="19"/>
                 <w:szCs w:val="19"/>
               </w:rPr>
-              <w:lastRenderedPageBreak/>
               <w:t>GET</w:t>
             </w:r>
           </w:p>
@@ -39777,7 +39918,7 @@
                 <w:sz w:val="19"/>
                 <w:szCs w:val="19"/>
               </w:rPr>
-              <w:t>200 { usuario, perfil } o { usuario: null }</w:t>
+              <w:t>200 { usuario, perfil, csrf } o { usuario: null }</w:t>
             </w:r>
           </w:p>
         </w:tc>
@@ -40339,7 +40480,7 @@
                 <w:sz w:val="19"/>
                 <w:szCs w:val="19"/>
               </w:rPr>
-              <w:t>Cookie, Content-Type, X-Requested-With</w:t>
+              <w:t>Cookie, Content-Type, X-Requested-With, X-CSRF-Token</w:t>
             </w:r>
           </w:p>
         </w:tc>
@@ -40805,7 +40946,7 @@
                 <w:sz w:val="19"/>
                 <w:szCs w:val="19"/>
               </w:rPr>
-              <w:t>Cookie, Content-Type, X-Requested-With</w:t>
+              <w:t>Cookie, Content-Type, X-Requested-With, X-CSRF-Token</w:t>
             </w:r>
           </w:p>
         </w:tc>
@@ -40961,7 +41102,7 @@
                 <w:sz w:val="19"/>
                 <w:szCs w:val="19"/>
               </w:rPr>
-              <w:t>Cookie, Content-Type, X-Requested-With</w:t>
+              <w:t>Cookie, Content-Type, X-Requested-With, X-CSRF-Token</w:t>
             </w:r>
           </w:p>
         </w:tc>
@@ -41116,7 +41257,7 @@
                 <w:sz w:val="19"/>
                 <w:szCs w:val="19"/>
               </w:rPr>
-              <w:t>Cookie, X-Requested-With</w:t>
+              <w:t>Cookie, X-Requested-With, X-CSRF-Token</w:t>
             </w:r>
           </w:p>
         </w:tc>
@@ -41272,7 +41413,7 @@
                 <w:sz w:val="19"/>
                 <w:szCs w:val="19"/>
               </w:rPr>
-              <w:t>Cookie, Content-Type, X-Requested-With</w:t>
+              <w:t>Cookie, Content-Type, X-Requested-With, X-CSRF-Token</w:t>
             </w:r>
           </w:p>
         </w:tc>
@@ -41427,7 +41568,7 @@
                 <w:sz w:val="19"/>
                 <w:szCs w:val="19"/>
               </w:rPr>
-              <w:t>Cookie, X-Requested-With</w:t>
+              <w:t>Cookie, X-Requested-With, X-CSRF-Token</w:t>
             </w:r>
           </w:p>
         </w:tc>
@@ -41583,7 +41724,15 @@
                 <w:sz w:val="19"/>
                 <w:szCs w:val="19"/>
               </w:rPr>
-              <w:t>Cookie, Content-Type, X-Requested-With</w:t>
+              <w:t>Cookie, Content-Type, X-</w:t>
+            </w:r>
+            <w:r>
+              <w:rPr>
+                <w:sz w:val="19"/>
+                <w:szCs w:val="19"/>
+              </w:rPr>
+              <w:lastRenderedPageBreak/>
+              <w:t>Requested-With, X-CSRF-Token</w:t>
             </w:r>
           </w:p>
         </w:tc>
@@ -41613,6 +41762,7 @@
                 <w:sz w:val="19"/>
                 <w:szCs w:val="19"/>
               </w:rPr>
+              <w:lastRenderedPageBreak/>
               <w:t>{ departamento_id, puesto_id, salario, fecha_ingreso }</w:t>
             </w:r>
           </w:p>
@@ -41738,7 +41888,7 @@
                 <w:sz w:val="19"/>
                 <w:szCs w:val="19"/>
               </w:rPr>
-              <w:t>Cookie, X-Requested-With</w:t>
+              <w:t>Cookie, X-Requested-With, X-CSRF-Token</w:t>
             </w:r>
           </w:p>
         </w:tc>
@@ -42049,7 +42199,7 @@
                 <w:sz w:val="19"/>
                 <w:szCs w:val="19"/>
               </w:rPr>
-              <w:t>Cookie, X-Requested-With</w:t>
+              <w:t>Cookie, X-Requested-With, X-CSRF-Token</w:t>
             </w:r>
           </w:p>
         </w:tc>
@@ -42613,7 +42763,6 @@
                 <w:sz w:val="19"/>
                 <w:szCs w:val="19"/>
               </w:rPr>
-              <w:lastRenderedPageBreak/>
               <w:t>GET</w:t>
             </w:r>
           </w:p>
@@ -42903,7 +43052,7 @@
       <w:pPr>
         <w:pStyle w:val="Ttulo2"/>
       </w:pPr>
-      <w:bookmarkStart w:id="30" w:name="_Toc241475922"/>
+      <w:bookmarkStart w:id="30" w:name="_Toc241477619"/>
       <w:r>
         <w:t>E.4 Ejemplos</w:t>
       </w:r>
@@ -42921,6 +43070,8 @@
     </w:p>
     <w:p>
       <w:pPr>
+        <w:keepNext/>
+        <w:keepLines/>
         <w:shd w:val="clear" w:color="auto" w:fill="F4F6FB"/>
         <w:ind w:left="200" w:right="200"/>
       </w:pPr>
@@ -42935,6 +43086,8 @@
     </w:p>
     <w:p>
       <w:pPr>
+        <w:keepNext/>
+        <w:keepLines/>
         <w:shd w:val="clear" w:color="auto" w:fill="F4F6FB"/>
         <w:ind w:left="200" w:right="200"/>
       </w:pPr>
@@ -42949,6 +43102,8 @@
     </w:p>
     <w:p>
       <w:pPr>
+        <w:keepNext/>
+        <w:keepLines/>
         <w:shd w:val="clear" w:color="auto" w:fill="F4F6FB"/>
         <w:ind w:left="200" w:right="200"/>
       </w:pPr>
@@ -42963,6 +43118,8 @@
     </w:p>
     <w:p>
       <w:pPr>
+        <w:keepNext/>
+        <w:keepLines/>
         <w:shd w:val="clear" w:color="auto" w:fill="F4F6FB"/>
         <w:ind w:left="200" w:right="200"/>
       </w:pPr>
@@ -42977,6 +43134,8 @@
     </w:p>
     <w:p>
       <w:pPr>
+        <w:keepNext/>
+        <w:keepLines/>
         <w:shd w:val="clear" w:color="auto" w:fill="F4F6FB"/>
         <w:ind w:left="200" w:right="200"/>
       </w:pPr>
@@ -42991,6 +43150,8 @@
     </w:p>
     <w:p>
       <w:pPr>
+        <w:keepNext/>
+        <w:keepLines/>
         <w:shd w:val="clear" w:color="auto" w:fill="F4F6FB"/>
         <w:ind w:left="200" w:right="200"/>
       </w:pPr>
@@ -43005,6 +43166,8 @@
     </w:p>
     <w:p>
       <w:pPr>
+        <w:keepNext/>
+        <w:keepLines/>
         <w:shd w:val="clear" w:color="auto" w:fill="F4F6FB"/>
         <w:ind w:left="200" w:right="200"/>
       </w:pPr>
@@ -43019,6 +43182,8 @@
     </w:p>
     <w:p>
       <w:pPr>
+        <w:keepNext/>
+        <w:keepLines/>
         <w:shd w:val="clear" w:color="auto" w:fill="F4F6FB"/>
         <w:ind w:left="200" w:right="200"/>
       </w:pPr>
@@ -43033,6 +43198,8 @@
     </w:p>
     <w:p>
       <w:pPr>
+        <w:keepNext/>
+        <w:keepLines/>
         <w:shd w:val="clear" w:color="auto" w:fill="F4F6FB"/>
         <w:ind w:left="200" w:right="200"/>
       </w:pPr>
@@ -43047,6 +43214,7 @@
     </w:p>
     <w:p>
       <w:pPr>
+        <w:keepLines/>
         <w:shd w:val="clear" w:color="auto" w:fill="F4F6FB"/>
         <w:spacing w:after="160"/>
         <w:ind w:left="200" w:right="200"/>
@@ -43057,7 +43225,7 @@
           <w:sz w:val="17"/>
           <w:szCs w:val="17"/>
         </w:rPr>
-        <w:t>{ "usuario": { "id": "…", "email": "rrhh@empresa.com" }, "perfil": { "rol": "rrhh", "activo": true } }</w:t>
+        <w:t>{ "usuario": { "id": "…", "email": "rrhh@empresa.com" }, "perfil": { "rol": "rrhh", "activo": true }, "csrf": "Q3J…" }</w:t>
       </w:r>
     </w:p>
     <w:p>
@@ -43072,6 +43240,8 @@
     </w:p>
     <w:p>
       <w:pPr>
+        <w:keepNext/>
+        <w:keepLines/>
         <w:shd w:val="clear" w:color="auto" w:fill="F4F6FB"/>
         <w:ind w:left="200" w:right="200"/>
       </w:pPr>
@@ -43086,6 +43256,8 @@
     </w:p>
     <w:p>
       <w:pPr>
+        <w:keepNext/>
+        <w:keepLines/>
         <w:shd w:val="clear" w:color="auto" w:fill="F4F6FB"/>
         <w:ind w:left="200" w:right="200"/>
       </w:pPr>
@@ -43100,6 +43272,8 @@
     </w:p>
     <w:p>
       <w:pPr>
+        <w:keepNext/>
+        <w:keepLines/>
         <w:shd w:val="clear" w:color="auto" w:fill="F4F6FB"/>
         <w:ind w:left="200" w:right="200"/>
       </w:pPr>
@@ -43109,11 +43283,20 @@
           <w:sz w:val="17"/>
           <w:szCs w:val="17"/>
         </w:rPr>
-        <w:t>HTTP/1.1 200 OK</w:t>
+        <w:t xml:space="preserve">HTTP/1.1 </w:t>
+      </w:r>
+      <w:r>
+        <w:rPr>
+          <w:rFonts w:ascii="Consolas" w:eastAsia="Consolas" w:hAnsi="Consolas" w:cs="Consolas"/>
+          <w:sz w:val="17"/>
+          <w:szCs w:val="17"/>
+        </w:rPr>
+        <w:t>200 OK</w:t>
       </w:r>
     </w:p>
     <w:p>
       <w:pPr>
+        <w:keepLines/>
         <w:shd w:val="clear" w:color="auto" w:fill="F4F6FB"/>
         <w:spacing w:after="160"/>
         <w:ind w:left="200" w:right="200"/>
@@ -43134,11 +43317,282 @@
         <w:keepLines/>
       </w:pPr>
       <w:r>
+        <w:lastRenderedPageBreak/>
+        <w:t>Modificación con token CSRF</w:t>
+      </w:r>
+    </w:p>
+    <w:p>
+      <w:pPr>
+        <w:keepNext/>
+        <w:keepLines/>
+        <w:shd w:val="clear" w:color="auto" w:fill="F4F6FB"/>
+        <w:ind w:left="200" w:right="200"/>
+      </w:pPr>
+      <w:r>
+        <w:rPr>
+          <w:rFonts w:ascii="Consolas" w:eastAsia="Consolas" w:hAnsi="Consolas" w:cs="Consolas"/>
+          <w:sz w:val="17"/>
+          <w:szCs w:val="17"/>
+        </w:rPr>
+        <w:t>PUT /api/v1/empleados/6daba4fb-…</w:t>
+      </w:r>
+    </w:p>
+    <w:p>
+      <w:pPr>
+        <w:keepNext/>
+        <w:keepLines/>
+        <w:shd w:val="clear" w:color="auto" w:fill="F4F6FB"/>
+        <w:ind w:left="200" w:right="200"/>
+      </w:pPr>
+      <w:r>
+        <w:rPr>
+          <w:rFonts w:ascii="Consolas" w:eastAsia="Consolas" w:hAnsi="Consolas" w:cs="Consolas"/>
+          <w:sz w:val="17"/>
+          <w:szCs w:val="17"/>
+        </w:rPr>
+        <w:t>Cookie: rrhh_at=eyJ…</w:t>
+      </w:r>
+    </w:p>
+    <w:p>
+      <w:pPr>
+        <w:keepNext/>
+        <w:keepLines/>
+        <w:shd w:val="clear" w:color="auto" w:fill="F4F6FB"/>
+        <w:ind w:left="200" w:right="200"/>
+      </w:pPr>
+      <w:r>
+        <w:rPr>
+          <w:rFonts w:ascii="Consolas" w:eastAsia="Consolas" w:hAnsi="Consolas" w:cs="Consolas"/>
+          <w:sz w:val="17"/>
+          <w:szCs w:val="17"/>
+        </w:rPr>
+        <w:t>Content-Type: application/json</w:t>
+      </w:r>
+    </w:p>
+    <w:p>
+      <w:pPr>
+        <w:keepNext/>
+        <w:keepLines/>
+        <w:shd w:val="clear" w:color="auto" w:fill="F4F6FB"/>
+        <w:ind w:left="200" w:right="200"/>
+      </w:pPr>
+      <w:r>
+        <w:rPr>
+          <w:rFonts w:ascii="Consolas" w:eastAsia="Consolas" w:hAnsi="Consolas" w:cs="Consolas"/>
+          <w:sz w:val="17"/>
+          <w:szCs w:val="17"/>
+        </w:rPr>
+        <w:t>X-Requested-With: fetch</w:t>
+      </w:r>
+    </w:p>
+    <w:p>
+      <w:pPr>
+        <w:keepNext/>
+        <w:keepLines/>
+        <w:shd w:val="clear" w:color="auto" w:fill="F4F6FB"/>
+        <w:ind w:left="200" w:right="200"/>
+      </w:pPr>
+      <w:r>
+        <w:rPr>
+          <w:rFonts w:ascii="Consolas" w:eastAsia="Consolas" w:hAnsi="Consolas" w:cs="Consolas"/>
+          <w:sz w:val="17"/>
+          <w:szCs w:val="17"/>
+        </w:rPr>
+        <w:t>X-CSRF-Token: Q3J…</w:t>
+      </w:r>
+    </w:p>
+    <w:p>
+      <w:pPr>
+        <w:keepNext/>
+        <w:keepLines/>
+        <w:shd w:val="clear" w:color="auto" w:fill="F4F6FB"/>
+        <w:ind w:left="200" w:right="200"/>
+      </w:pPr>
+      <w:r>
+        <w:rPr>
+          <w:rFonts w:ascii="Consolas" w:eastAsia="Consolas" w:hAnsi="Consolas" w:cs="Consolas"/>
+          <w:sz w:val="17"/>
+          <w:szCs w:val="17"/>
+        </w:rPr>
+        <w:t xml:space="preserve"> </w:t>
+      </w:r>
+    </w:p>
+    <w:p>
+      <w:pPr>
+        <w:keepNext/>
+        <w:keepLines/>
+        <w:shd w:val="clear" w:color="auto" w:fill="F4F6FB"/>
+        <w:ind w:left="200" w:right="200"/>
+      </w:pPr>
+      <w:r>
+        <w:rPr>
+          <w:rFonts w:ascii="Consolas" w:eastAsia="Consolas" w:hAnsi="Consolas" w:cs="Consolas"/>
+          <w:sz w:val="17"/>
+          <w:szCs w:val="17"/>
+        </w:rPr>
+        <w:t>{ "datos": { "telefo</w:t>
+      </w:r>
+      <w:r>
+        <w:rPr>
+          <w:rFonts w:ascii="Consolas" w:eastAsia="Consolas" w:hAnsi="Consolas" w:cs="Consolas"/>
+          <w:sz w:val="17"/>
+          <w:szCs w:val="17"/>
+        </w:rPr>
+        <w:t>no": "5555-1234" } }</w:t>
+      </w:r>
+    </w:p>
+    <w:p>
+      <w:pPr>
+        <w:keepNext/>
+        <w:keepLines/>
+        <w:shd w:val="clear" w:color="auto" w:fill="F4F6FB"/>
+        <w:ind w:left="200" w:right="200"/>
+      </w:pPr>
+      <w:r>
+        <w:rPr>
+          <w:rFonts w:ascii="Consolas" w:eastAsia="Consolas" w:hAnsi="Consolas" w:cs="Consolas"/>
+          <w:sz w:val="17"/>
+          <w:szCs w:val="17"/>
+        </w:rPr>
+        <w:t xml:space="preserve"> </w:t>
+      </w:r>
+    </w:p>
+    <w:p>
+      <w:pPr>
+        <w:keepNext/>
+        <w:keepLines/>
+        <w:shd w:val="clear" w:color="auto" w:fill="F4F6FB"/>
+        <w:ind w:left="200" w:right="200"/>
+      </w:pPr>
+      <w:r>
+        <w:rPr>
+          <w:rFonts w:ascii="Consolas" w:eastAsia="Consolas" w:hAnsi="Consolas" w:cs="Consolas"/>
+          <w:sz w:val="17"/>
+          <w:szCs w:val="17"/>
+        </w:rPr>
+        <w:t>HTTP/1.1 200 OK</w:t>
+      </w:r>
+    </w:p>
+    <w:p>
+      <w:pPr>
+        <w:keepLines/>
+        <w:shd w:val="clear" w:color="auto" w:fill="F4F6FB"/>
+        <w:spacing w:after="160"/>
+        <w:ind w:left="200" w:right="200"/>
+      </w:pPr>
+      <w:r>
+        <w:rPr>
+          <w:rFonts w:ascii="Consolas" w:eastAsia="Consolas" w:hAnsi="Consolas" w:cs="Consolas"/>
+          <w:sz w:val="17"/>
+          <w:szCs w:val="17"/>
+        </w:rPr>
+        <w:t>{ "datos": [ { "id": "6daba4fb-…", "telefono": "5555-1234" } ] }</w:t>
+      </w:r>
+    </w:p>
+    <w:p>
+      <w:pPr>
+        <w:pStyle w:val="Ttulo3"/>
+        <w:keepNext/>
+        <w:keepLines/>
+      </w:pPr>
+      <w:r>
+        <w:t>Consulta desde Postman con Authorization</w:t>
+      </w:r>
+    </w:p>
+    <w:p>
+      <w:pPr>
+        <w:keepNext/>
+        <w:keepLines/>
+        <w:shd w:val="clear" w:color="auto" w:fill="F4F6FB"/>
+        <w:ind w:left="200" w:right="200"/>
+      </w:pPr>
+      <w:r>
+        <w:rPr>
+          <w:rFonts w:ascii="Consolas" w:eastAsia="Consolas" w:hAnsi="Consolas" w:cs="Consolas"/>
+          <w:sz w:val="17"/>
+          <w:szCs w:val="17"/>
+        </w:rPr>
+        <w:t>GET /api/v1/departamentos</w:t>
+      </w:r>
+    </w:p>
+    <w:p>
+      <w:pPr>
+        <w:keepNext/>
+        <w:keepLines/>
+        <w:shd w:val="clear" w:color="auto" w:fill="F4F6FB"/>
+        <w:ind w:left="200" w:right="200"/>
+      </w:pPr>
+      <w:r>
+        <w:rPr>
+          <w:rFonts w:ascii="Consolas" w:eastAsia="Consolas" w:hAnsi="Consolas" w:cs="Consolas"/>
+          <w:sz w:val="17"/>
+          <w:szCs w:val="17"/>
+        </w:rPr>
+        <w:t>Authorization: Bearer eyJ…</w:t>
+      </w:r>
+    </w:p>
+    <w:p>
+      <w:pPr>
+        <w:keepNext/>
+        <w:keepLines/>
+        <w:shd w:val="clear" w:color="auto" w:fill="F4F6FB"/>
+        <w:ind w:left="200" w:right="200"/>
+      </w:pPr>
+      <w:r>
+        <w:rPr>
+          <w:rFonts w:ascii="Consolas" w:eastAsia="Consolas" w:hAnsi="Consolas" w:cs="Consolas"/>
+          <w:sz w:val="17"/>
+          <w:szCs w:val="17"/>
+        </w:rPr>
+        <w:t xml:space="preserve"> </w:t>
+      </w:r>
+    </w:p>
+    <w:p>
+      <w:pPr>
+        <w:keepNext/>
+        <w:keepLines/>
+        <w:shd w:val="clear" w:color="auto" w:fill="F4F6FB"/>
+        <w:ind w:left="200" w:right="200"/>
+      </w:pPr>
+      <w:r>
+        <w:rPr>
+          <w:rFonts w:ascii="Consolas" w:eastAsia="Consolas" w:hAnsi="Consolas" w:cs="Consolas"/>
+          <w:sz w:val="17"/>
+          <w:szCs w:val="17"/>
+        </w:rPr>
+        <w:t>HTTP/1.1 200 OK</w:t>
+      </w:r>
+    </w:p>
+    <w:p>
+      <w:pPr>
+        <w:keepLines/>
+        <w:shd w:val="clear" w:color="auto" w:fill="F4F6FB"/>
+        <w:spacing w:after="160"/>
+        <w:ind w:left="200" w:right="200"/>
+      </w:pPr>
+      <w:r>
+        <w:rPr>
+          <w:rFonts w:ascii="Consolas" w:eastAsia="Consolas" w:hAnsi="Consolas" w:cs="Consolas"/>
+          <w:sz w:val="17"/>
+          <w:szCs w:val="17"/>
+        </w:rPr>
+        <w:t>{ "datos": [ { "id": "…", "nombre": "Recursos Humanos" } ] }</w:t>
+      </w:r>
+    </w:p>
+    <w:p>
+      <w:pPr>
+        <w:pStyle w:val="Ttulo3"/>
+        <w:keepNext/>
+        <w:keepLines/>
+      </w:pPr>
+      <w:r>
         <w:t>Error estructurado</w:t>
       </w:r>
     </w:p>
     <w:p>
       <w:pPr>
+        <w:keepNext/>
+        <w:keepLines/>
         <w:shd w:val="clear" w:color="auto" w:fill="F4F6FB"/>
         <w:ind w:left="200" w:right="200"/>
       </w:pPr>
@@ -43153,6 +43607,7 @@
     </w:p>
     <w:p>
       <w:pPr>
+        <w:keepLines/>
         <w:shd w:val="clear" w:color="auto" w:fill="F4F6FB"/>
         <w:spacing w:after="160"/>
         <w:ind w:left="200" w:right="200"/>
@@ -43171,7 +43626,7 @@
         <w:pStyle w:val="Ttulo1"/>
         <w:pageBreakBefore/>
       </w:pPr>
-      <w:bookmarkStart w:id="31" w:name="_Toc241475923"/>
+      <w:bookmarkStart w:id="31" w:name="_Toc241477620"/>
       <w:r>
         <w:lastRenderedPageBreak/>
         <w:t>F. Plan de Seguridad y Mitigaciones OWASP</w:t>
@@ -43182,9 +43637,12 @@
       <w:pPr>
         <w:pStyle w:val="Ttulo2"/>
       </w:pPr>
-      <w:bookmarkStart w:id="32" w:name="_Toc241475924"/>
+      <w:bookmarkStart w:id="32" w:name="_Toc241477621"/>
       <w:r>
-        <w:t>F.1 Manejo de sesiones y autenticación</w:t>
+        <w:t>F.1 Manejo de sesiones y</w:t>
+      </w:r>
+      <w:r>
+        <w:t xml:space="preserve"> autenticación</w:t>
       </w:r>
       <w:bookmarkEnd w:id="32"/>
     </w:p>
@@ -43241,14 +43699,14 @@
           <w:b/>
           <w:bCs/>
         </w:rPr>
-        <w:t xml:space="preserve">cookies HttpOnly, Secure </w:t>
+        <w:t>cookies Ht</w:t>
       </w:r>
       <w:r>
         <w:rPr>
           <w:b/>
           <w:bCs/>
         </w:rPr>
-        <w:t>y SameSite=Strict</w:t>
+        <w:t>tpOnly, Secure y SameSite=Strict</w:t>
       </w:r>
       <w:r>
         <w:t xml:space="preserve"> con </w:t>
@@ -43299,24 +43757,58 @@
         <w:spacing w:after="60"/>
       </w:pPr>
       <w:r>
-        <w:t xml:space="preserve">Las consultas a Supabase se hacen </w:t>
+        <w:t>Las consultas a Supabase s</w:t>
+      </w:r>
+      <w:r>
+        <w:t xml:space="preserve">e hacen </w:t>
       </w:r>
       <w:r>
         <w:rPr>
           <w:b/>
           <w:bCs/>
         </w:rPr>
-        <w:t xml:space="preserve">con el </w:t>
+        <w:t>con el JWT del usuario</w:t>
+      </w:r>
+      <w:r>
+        <w:t>, de modo que las políticas RLS se aplican siempre.</w:t>
+      </w:r>
+    </w:p>
+    <w:p>
+      <w:pPr>
+        <w:pStyle w:val="Prrafodelista"/>
+        <w:numPr>
+          <w:ilvl w:val="0"/>
+          <w:numId w:val="9"/>
+        </w:numPr>
+        <w:spacing w:after="60"/>
+      </w:pPr>
+      <w:r>
+        <w:t xml:space="preserve">Junto con la sesión, la API entrega un </w:t>
       </w:r>
       <w:r>
         <w:rPr>
           <w:b/>
           <w:bCs/>
         </w:rPr>
-        <w:t>JWT del usuario</w:t>
+        <w:t>token anti-CSRF</w:t>
       </w:r>
       <w:r>
-        <w:t>, de modo que las políticas RLS se aplican siempre.</w:t>
+        <w:t xml:space="preserve">: un HMAC-SHA256 del identificador de la sesión firmado con un secreto del servidor. La SPA lo guarda solo en memoria y </w:t>
+      </w:r>
+      <w:r>
+        <w:t xml:space="preserve">lo envía en </w:t>
+      </w:r>
+      <w:r>
+        <w:rPr>
+          <w:rFonts w:ascii="Consolas" w:eastAsia="Consolas" w:hAnsi="Consolas" w:cs="Consolas"/>
+          <w:color w:val="1B2233"/>
+          <w:sz w:val="19"/>
+          <w:szCs w:val="19"/>
+        </w:rPr>
+        <w:t>X-CSRF-Token</w:t>
+      </w:r>
+      <w:r>
+        <w:t xml:space="preserve"> en cada modificación; la API lo compara en tiempo constante.</w:t>
       </w:r>
     </w:p>
     <w:p>
@@ -43347,7 +43839,7 @@
           <w:left w:w="10" w:type="dxa"/>
           <w:right w:w="10" w:type="dxa"/>
         </w:tblCellMar>
-        <w:tblLook w:val="04A0" w:firstRow="1" w:lastRow="0" w:firstColumn="1" w:lastColumn="0" w:noHBand="0" w:noVBand="1"/>
+        <w:tblLook w:val="0000" w:firstRow="0" w:lastRow="0" w:firstColumn="0" w:lastColumn="0" w:noHBand="0" w:noVBand="0"/>
       </w:tblPr>
       <w:tblGrid>
         <w:gridCol w:w="2808"/>
@@ -43774,7 +44266,7 @@
       <w:pPr>
         <w:pStyle w:val="Ttulo2"/>
       </w:pPr>
-      <w:bookmarkStart w:id="33" w:name="_Toc241475925"/>
+      <w:bookmarkStart w:id="33" w:name="_Toc241477622"/>
       <w:r>
         <w:t>F.2 Matriz de mitigación de vulnerabilidades</w:t>
       </w:r>
@@ -43795,7 +44287,7 @@
           <w:left w:w="10" w:type="dxa"/>
           <w:right w:w="10" w:type="dxa"/>
         </w:tblCellMar>
-        <w:tblLook w:val="04A0" w:firstRow="1" w:lastRow="0" w:firstColumn="1" w:lastColumn="0" w:noHBand="0" w:noVBand="1"/>
+        <w:tblLook w:val="0000" w:firstRow="0" w:lastRow="0" w:firstColumn="0" w:lastColumn="0" w:noHBand="0" w:noVBand="0"/>
       </w:tblPr>
       <w:tblGrid>
         <w:gridCol w:w="2246"/>
@@ -44050,14 +44542,7 @@
                 <w:sz w:val="19"/>
                 <w:szCs w:val="19"/>
               </w:rPr>
-              <w:t>Sanitización de entradas: se elimina</w:t>
-            </w:r>
-            <w:r>
-              <w:rPr>
-                <w:sz w:val="19"/>
-                <w:szCs w:val="19"/>
-              </w:rPr>
-              <w:t>n etiquetas HTML y caracteres de control; validación de tipo y longitud; cookies HttpOnly</w:t>
+              <w:t>Sanitización de entradas: se eliminan etiquetas HTML y caracteres de control; validación de tipo y longitud; cookies HttpOnly</w:t>
             </w:r>
           </w:p>
         </w:tc>
@@ -44125,7 +44610,7 @@
                 <w:sz w:val="19"/>
                 <w:szCs w:val="19"/>
               </w:rPr>
-              <w:t xml:space="preserve">Todas las peticiones de cambio envían </w:t>
+              <w:t xml:space="preserve">Las peticiones de cambio envían </w:t>
             </w:r>
             <w:r>
               <w:rPr>
@@ -44136,6 +44621,29 @@
               </w:rPr>
               <w:t>X-Requested-With: fetch</w:t>
             </w:r>
+            <w:r>
+              <w:rPr>
+                <w:sz w:val="19"/>
+                <w:szCs w:val="19"/>
+              </w:rPr>
+              <w:t xml:space="preserve"> y el token </w:t>
+            </w:r>
+            <w:r>
+              <w:rPr>
+                <w:rFonts w:ascii="Consolas" w:eastAsia="Consolas" w:hAnsi="Consolas" w:cs="Consolas"/>
+                <w:color w:val="1B2233"/>
+                <w:sz w:val="19"/>
+                <w:szCs w:val="19"/>
+              </w:rPr>
+              <w:t>X-CSRF-Token</w:t>
+            </w:r>
+            <w:r>
+              <w:rPr>
+                <w:sz w:val="19"/>
+                <w:szCs w:val="19"/>
+              </w:rPr>
+              <w:t>, guardado solo en memoria</w:t>
+            </w:r>
           </w:p>
         </w:tc>
         <w:tc>
@@ -44164,7 +44672,7 @@
                 <w:sz w:val="19"/>
                 <w:szCs w:val="19"/>
               </w:rPr>
-              <w:t>Cookies SameSite=Strict; la API rechaza (403) peticiones sin la cabecera o con un Origin distinto; sin CORS habilitado</w:t>
+              <w:t>Validación del token CSRF (HMAC ligado a la sesión); cookies SameSite=Strict; la API rechaza (403) peticiones sin cabecera, sin token válido o con un Origin distinto; sin CORS habilitado</w:t>
             </w:r>
           </w:p>
         </w:tc>
@@ -44201,6 +44709,7 @@
                 <w:sz w:val="19"/>
                 <w:szCs w:val="19"/>
               </w:rPr>
+              <w:lastRenderedPageBreak/>
               <w:t>Inyección SQL (A03)</w:t>
             </w:r>
           </w:p>
@@ -44313,7 +44822,6 @@
                 <w:sz w:val="19"/>
                 <w:szCs w:val="19"/>
               </w:rPr>
-              <w:lastRenderedPageBreak/>
               <w:t>Control de acceso roto (A01)</w:t>
             </w:r>
           </w:p>
@@ -44374,7 +44882,7 @@
                 <w:sz w:val="19"/>
                 <w:szCs w:val="19"/>
               </w:rPr>
-              <w:t>RBAC con 5 roles y 58 políticas RLS en la base de datos: la regla se cumple aunque se manipule el cliente</w:t>
+              <w:t>RBAC con 5 roles y 57 políticas RLS en la base de datos: la regla se cumple aunque se manipule el cliente</w:t>
             </w:r>
           </w:p>
         </w:tc>
@@ -45009,7 +45517,7 @@
       <w:pPr>
         <w:pStyle w:val="Ttulo2"/>
       </w:pPr>
-      <w:bookmarkStart w:id="34" w:name="_Toc241475926"/>
+      <w:bookmarkStart w:id="34" w:name="_Toc241477623"/>
       <w:r>
         <w:t>F.3 Manejo seguro de secretos</w:t>
       </w:r>
@@ -45030,7 +45538,7 @@
           <w:left w:w="10" w:type="dxa"/>
           <w:right w:w="10" w:type="dxa"/>
         </w:tblCellMar>
-        <w:tblLook w:val="04A0" w:firstRow="1" w:lastRow="0" w:firstColumn="1" w:lastColumn="0" w:noHBand="0" w:noVBand="1"/>
+        <w:tblLook w:val="0000" w:firstRow="0" w:lastRow="0" w:firstColumn="0" w:lastColumn="0" w:noHBand="0" w:noVBand="0"/>
       </w:tblPr>
       <w:tblGrid>
         <w:gridCol w:w="3182"/>
@@ -45588,7 +46096,7 @@
         <w:pStyle w:val="Ttulo1"/>
         <w:pageBreakBefore/>
       </w:pPr>
-      <w:bookmarkStart w:id="35" w:name="_Toc241475927"/>
+      <w:bookmarkStart w:id="35" w:name="_Toc241477624"/>
       <w:r>
         <w:lastRenderedPageBreak/>
         <w:t>Anexo. Referencias del proyecto</w:t>
@@ -45610,7 +46118,7 @@
           <w:left w:w="10" w:type="dxa"/>
           <w:right w:w="10" w:type="dxa"/>
         </w:tblCellMar>
-        <w:tblLook w:val="04A0" w:firstRow="1" w:lastRow="0" w:firstColumn="1" w:lastColumn="0" w:noHBand="0" w:noVBand="1"/>
+        <w:tblLook w:val="0000" w:firstRow="0" w:lastRow="0" w:firstColumn="0" w:lastColumn="0" w:noHBand="0" w:noVBand="0"/>
       </w:tblPr>
       <w:tblGrid>
         <w:gridCol w:w="2808"/>
@@ -46090,7 +46598,7 @@
                 <w:sz w:val="19"/>
                 <w:szCs w:val="19"/>
               </w:rPr>
-              <w:t>tests/ — 22 casos (nómina, montos en letras, validación y seguridad de la API)</w:t>
+              <w:t>tests/ — 24 casos (nómina, montos en letras, validación y seguridad de la API)</w:t>
             </w:r>
           </w:p>
         </w:tc>
@@ -46281,10 +46789,122 @@
 <file path=word/numbering.xml><?xml version="1.0" encoding="utf-8"?>
 <w:numbering xmlns:wpc="http://schemas.microsoft.com/office/word/2010/wordprocessingCanvas" xmlns:cx="http://schemas.microsoft.com/office/drawing/2014/chartex" xmlns:cx1="http://schemas.microsoft.com/office/drawing/2015/9/8/chartex" xmlns:cx2="http://schemas.microsoft.com/office/drawing/2015/10/21/chartex" xmlns:cx3="http://schemas.microsoft.com/office/drawing/2016/5/9/chartex" xmlns:cx4="http://schemas.microsoft.com/office/drawing/2016/5/10/chartex" xmlns:cx5="http://schemas.microsoft.com/office/drawing/2016/5/11/chartex" xmlns:cx6="http://schemas.microsoft.com/office/drawing/2016/5/12/chartex" xmlns:cx7="http://schemas.microsoft.com/office/drawing/2016/5/13/chartex" xmlns:cx8="http://schemas.microsoft.com/office/drawing/2016/5/14/chartex" xmlns:mc="http://schemas.openxmlformats.org/markup-compatibility/2006" xmlns:aink="http://schemas.microsoft.com/office/drawing/2016/ink" xmlns:am3d="http://schemas.microsoft.com/office/drawing/2017/model3d" xmlns:o="urn:schemas-microsoft-com:office:office" xmlns:r="http://schemas.openxmlformats.org/officeDocument/2006/relationships" xmlns:m="http://schemas.openxmlformats.org/officeDocument/2006/math" xmlns:v="urn:schemas-microsoft-com:vml" xmlns:wp14="http://schemas.microsoft.com/office/word/2010/wordprocessingDrawing" xmlns:wp="http://schemas.openxmlformats.org/drawingml/2006/wordprocessingDrawing" xmlns:w10="urn:schemas-microsoft-com:office:word" xmlns:w="http://schemas.openxmlformats.org/wordprocessingml/2006/main" xmlns:w14="http://schemas.microsoft.com/office/word/2010/wordml" xmlns:w15="http://schemas.microsoft.com/office/word/2012/wordml" xmlns:w16cex="http://schemas.microsoft.com/office/word/2018/wordml/cex" xmlns:w16cid="http://schemas.microsoft.com/office/word/2016/wordml/cid" xmlns:w16="http://schemas.microsoft.com/office/word/2018/wordml" xmlns:w16sdtdh="http://schemas.microsoft.com/office/word/2020/wordml/sdtdatahash" xmlns:w16se="http://schemas.microsoft.com/office/word/2015/wordml/symex" xmlns:wpg="http://schemas.microsoft.com/office/word/2010/wordprocessingGroup" xmlns:wpi="http://schemas.microsoft.com/office/word/2010/wordprocessingInk" xmlns:wne="http://schemas.microsoft.com/office/word/2006/wordml" xmlns:wps="http://schemas.microsoft.com/office/word/2010/wordprocessingShape" mc:Ignorable="w14 w15 w16se w16cid w16 w16cex w16sdtdh wp14">
   <w:abstractNum w:abstractNumId="0" w15:restartNumberingAfterBreak="0">
-    <w:nsid w:val="0FAD150E"/>
+    <w:nsid w:val="01EB3ADD"/>
     <w:multiLevelType w:val="hybridMultilevel"/>
-    <w:tmpl w:val="D430B0FC"/>
-    <w:lvl w:ilvl="0" w:tplc="46882446">
+    <w:tmpl w:val="D9308398"/>
+    <w:lvl w:ilvl="0" w:tplc="D5EA34EA">
+      <w:start w:val="1"/>
+      <w:numFmt w:val="bullet"/>
+      <w:lvlText w:val="•"/>
+      <w:lvlJc w:val="left"/>
+      <w:pPr>
+        <w:ind w:left="540" w:hanging="270"/>
+      </w:pPr>
+    </w:lvl>
+    <w:lvl w:ilvl="1" w:tplc="50986FA2">
+      <w:start w:val="1"/>
+      <w:numFmt w:val="bullet"/>
+      <w:lvlText w:val="◦"/>
+      <w:lvlJc w:val="left"/>
+      <w:pPr>
+        <w:ind w:left="1080" w:hanging="270"/>
+      </w:pPr>
+    </w:lvl>
+    <w:lvl w:ilvl="2" w:tplc="227AFB6C">
+      <w:numFmt w:val="decimal"/>
+      <w:lvlText w:val=""/>
+      <w:lvlJc w:val="left"/>
+    </w:lvl>
+    <w:lvl w:ilvl="3" w:tplc="251854B8">
+      <w:numFmt w:val="decimal"/>
+      <w:lvlText w:val=""/>
+      <w:lvlJc w:val="left"/>
+    </w:lvl>
+    <w:lvl w:ilvl="4" w:tplc="80C81ADE">
+      <w:numFmt w:val="decimal"/>
+      <w:lvlText w:val=""/>
+      <w:lvlJc w:val="left"/>
+    </w:lvl>
+    <w:lvl w:ilvl="5" w:tplc="2C309288">
+      <w:numFmt w:val="decimal"/>
+      <w:lvlText w:val=""/>
+      <w:lvlJc w:val="left"/>
+    </w:lvl>
+    <w:lvl w:ilvl="6" w:tplc="E29C39D2">
+      <w:numFmt w:val="decimal"/>
+      <w:lvlText w:val=""/>
+      <w:lvlJc w:val="left"/>
+    </w:lvl>
+    <w:lvl w:ilvl="7" w:tplc="AB30C6D6">
+      <w:numFmt w:val="decimal"/>
+      <w:lvlText w:val=""/>
+      <w:lvlJc w:val="left"/>
+    </w:lvl>
+    <w:lvl w:ilvl="8" w:tplc="840C5934">
+      <w:numFmt w:val="decimal"/>
+      <w:lvlText w:val=""/>
+      <w:lvlJc w:val="left"/>
+    </w:lvl>
+  </w:abstractNum>
+  <w:abstractNum w:abstractNumId="1" w15:restartNumberingAfterBreak="0">
+    <w:nsid w:val="4505072F"/>
+    <w:multiLevelType w:val="hybridMultilevel"/>
+    <w:tmpl w:val="B308AC40"/>
+    <w:lvl w:ilvl="0" w:tplc="B9D00E30">
+      <w:start w:val="1"/>
+      <w:numFmt w:val="decimal"/>
+      <w:lvlText w:val="%1."/>
+      <w:lvlJc w:val="left"/>
+      <w:pPr>
+        <w:ind w:left="540" w:hanging="300"/>
+      </w:pPr>
+    </w:lvl>
+    <w:lvl w:ilvl="1" w:tplc="C810A854">
+      <w:numFmt w:val="decimal"/>
+      <w:lvlText w:val=""/>
+      <w:lvlJc w:val="left"/>
+    </w:lvl>
+    <w:lvl w:ilvl="2" w:tplc="4E2EAD10">
+      <w:numFmt w:val="decimal"/>
+      <w:lvlText w:val=""/>
+      <w:lvlJc w:val="left"/>
+    </w:lvl>
+    <w:lvl w:ilvl="3" w:tplc="C3307FD4">
+      <w:numFmt w:val="decimal"/>
+      <w:lvlText w:val=""/>
+      <w:lvlJc w:val="left"/>
+    </w:lvl>
+    <w:lvl w:ilvl="4" w:tplc="894A4676">
+      <w:numFmt w:val="decimal"/>
+      <w:lvlText w:val=""/>
+      <w:lvlJc w:val="left"/>
+    </w:lvl>
+    <w:lvl w:ilvl="5" w:tplc="9E0A583A">
+      <w:numFmt w:val="decimal"/>
+      <w:lvlText w:val=""/>
+      <w:lvlJc w:val="left"/>
+    </w:lvl>
+    <w:lvl w:ilvl="6" w:tplc="120A4FFC">
+      <w:numFmt w:val="decimal"/>
+      <w:lvlText w:val=""/>
+      <w:lvlJc w:val="left"/>
+    </w:lvl>
+    <w:lvl w:ilvl="7" w:tplc="D63430BE">
+      <w:numFmt w:val="decimal"/>
+      <w:lvlText w:val=""/>
+      <w:lvlJc w:val="left"/>
+    </w:lvl>
+    <w:lvl w:ilvl="8" w:tplc="445279B0">
+      <w:numFmt w:val="decimal"/>
+      <w:lvlText w:val=""/>
+      <w:lvlJc w:val="left"/>
+    </w:lvl>
+  </w:abstractNum>
+  <w:abstractNum w:abstractNumId="2" w15:restartNumberingAfterBreak="0">
+    <w:nsid w:val="6AE468AA"/>
+    <w:multiLevelType w:val="hybridMultilevel"/>
+    <w:tmpl w:val="1D467D2C"/>
+    <w:lvl w:ilvl="0" w:tplc="66122080">
       <w:start w:val="1"/>
       <w:numFmt w:val="bullet"/>
       <w:lvlText w:val="●"/>
@@ -46293,7 +46913,7 @@
         <w:ind w:left="720" w:hanging="360"/>
       </w:pPr>
     </w:lvl>
-    <w:lvl w:ilvl="1" w:tplc="E9146B40">
+    <w:lvl w:ilvl="1" w:tplc="2DAC76A6">
       <w:start w:val="1"/>
       <w:numFmt w:val="bullet"/>
       <w:lvlText w:val="○"/>
@@ -46302,7 +46922,7 @@
         <w:ind w:left="1440" w:hanging="360"/>
       </w:pPr>
     </w:lvl>
-    <w:lvl w:ilvl="2" w:tplc="D6E6F77C">
+    <w:lvl w:ilvl="2" w:tplc="45DA2B56">
       <w:start w:val="1"/>
       <w:numFmt w:val="bullet"/>
       <w:lvlText w:val="■"/>
@@ -46311,7 +46931,7 @@
         <w:ind w:left="2160" w:hanging="360"/>
       </w:pPr>
     </w:lvl>
-    <w:lvl w:ilvl="3" w:tplc="1B8047DA">
+    <w:lvl w:ilvl="3" w:tplc="D18A520E">
       <w:start w:val="1"/>
       <w:numFmt w:val="bullet"/>
       <w:lvlText w:val="●"/>
@@ -46320,7 +46940,7 @@
         <w:ind w:left="2880" w:hanging="360"/>
       </w:pPr>
     </w:lvl>
-    <w:lvl w:ilvl="4" w:tplc="C3B4445A">
+    <w:lvl w:ilvl="4" w:tplc="4986F35A">
       <w:start w:val="1"/>
       <w:numFmt w:val="bullet"/>
       <w:lvlText w:val="○"/>
@@ -46329,7 +46949,7 @@
         <w:ind w:left="3600" w:hanging="360"/>
       </w:pPr>
     </w:lvl>
-    <w:lvl w:ilvl="5" w:tplc="C7C8D9A8">
+    <w:lvl w:ilvl="5" w:tplc="4C9EC5EC">
       <w:start w:val="1"/>
       <w:numFmt w:val="bullet"/>
       <w:lvlText w:val="■"/>
@@ -46338,7 +46958,7 @@
         <w:ind w:left="4320" w:hanging="360"/>
       </w:pPr>
     </w:lvl>
-    <w:lvl w:ilvl="6" w:tplc="C41CDF20">
+    <w:lvl w:ilvl="6" w:tplc="981AAB9E">
       <w:start w:val="1"/>
       <w:numFmt w:val="bullet"/>
       <w:lvlText w:val="●"/>
@@ -46347,7 +46967,7 @@
         <w:ind w:left="5040" w:hanging="360"/>
       </w:pPr>
     </w:lvl>
-    <w:lvl w:ilvl="7" w:tplc="574EC77E">
+    <w:lvl w:ilvl="7" w:tplc="5C64C09A">
       <w:start w:val="1"/>
       <w:numFmt w:val="bullet"/>
       <w:lvlText w:val="●"/>
@@ -46356,7 +46976,7 @@
         <w:ind w:left="5760" w:hanging="360"/>
       </w:pPr>
     </w:lvl>
-    <w:lvl w:ilvl="8" w:tplc="CDA83904">
+    <w:lvl w:ilvl="8" w:tplc="63924F00">
       <w:start w:val="1"/>
       <w:numFmt w:val="bullet"/>
       <w:lvlText w:val="●"/>
@@ -46366,168 +46986,56 @@
       </w:pPr>
     </w:lvl>
   </w:abstractNum>
-  <w:abstractNum w:abstractNumId="1" w15:restartNumberingAfterBreak="0">
-    <w:nsid w:val="4BA67711"/>
-    <w:multiLevelType w:val="hybridMultilevel"/>
-    <w:tmpl w:val="3EB4FDDE"/>
-    <w:lvl w:ilvl="0" w:tplc="E8E4F56C">
-      <w:start w:val="1"/>
-      <w:numFmt w:val="bullet"/>
-      <w:lvlText w:val="•"/>
-      <w:lvlJc w:val="left"/>
-      <w:pPr>
-        <w:ind w:left="540" w:hanging="270"/>
-      </w:pPr>
-    </w:lvl>
-    <w:lvl w:ilvl="1" w:tplc="BB24D5C2">
-      <w:start w:val="1"/>
-      <w:numFmt w:val="bullet"/>
-      <w:lvlText w:val="◦"/>
-      <w:lvlJc w:val="left"/>
-      <w:pPr>
-        <w:ind w:left="1080" w:hanging="270"/>
-      </w:pPr>
-    </w:lvl>
-    <w:lvl w:ilvl="2" w:tplc="083A0542">
-      <w:numFmt w:val="decimal"/>
-      <w:lvlText w:val=""/>
-      <w:lvlJc w:val="left"/>
-    </w:lvl>
-    <w:lvl w:ilvl="3" w:tplc="F1DC2604">
-      <w:numFmt w:val="decimal"/>
-      <w:lvlText w:val=""/>
-      <w:lvlJc w:val="left"/>
-    </w:lvl>
-    <w:lvl w:ilvl="4" w:tplc="D0B8E2B6">
-      <w:numFmt w:val="decimal"/>
-      <w:lvlText w:val=""/>
-      <w:lvlJc w:val="left"/>
-    </w:lvl>
-    <w:lvl w:ilvl="5" w:tplc="E0A82B9C">
-      <w:numFmt w:val="decimal"/>
-      <w:lvlText w:val=""/>
-      <w:lvlJc w:val="left"/>
-    </w:lvl>
-    <w:lvl w:ilvl="6" w:tplc="6DBC3E0E">
-      <w:numFmt w:val="decimal"/>
-      <w:lvlText w:val=""/>
-      <w:lvlJc w:val="left"/>
-    </w:lvl>
-    <w:lvl w:ilvl="7" w:tplc="0010DBAE">
-      <w:numFmt w:val="decimal"/>
-      <w:lvlText w:val=""/>
-      <w:lvlJc w:val="left"/>
-    </w:lvl>
-    <w:lvl w:ilvl="8" w:tplc="44F26546">
-      <w:numFmt w:val="decimal"/>
-      <w:lvlText w:val=""/>
-      <w:lvlJc w:val="left"/>
-    </w:lvl>
-  </w:abstractNum>
-  <w:abstractNum w:abstractNumId="2" w15:restartNumberingAfterBreak="0">
-    <w:nsid w:val="4D70136A"/>
-    <w:multiLevelType w:val="hybridMultilevel"/>
-    <w:tmpl w:val="03006472"/>
-    <w:lvl w:ilvl="0" w:tplc="CABC06E2">
-      <w:start w:val="1"/>
-      <w:numFmt w:val="decimal"/>
-      <w:lvlText w:val="%1."/>
-      <w:lvlJc w:val="left"/>
-      <w:pPr>
-        <w:ind w:left="540" w:hanging="300"/>
-      </w:pPr>
-    </w:lvl>
-    <w:lvl w:ilvl="1" w:tplc="486CCBE2">
-      <w:numFmt w:val="decimal"/>
-      <w:lvlText w:val=""/>
-      <w:lvlJc w:val="left"/>
-    </w:lvl>
-    <w:lvl w:ilvl="2" w:tplc="54BC29F2">
-      <w:numFmt w:val="decimal"/>
-      <w:lvlText w:val=""/>
-      <w:lvlJc w:val="left"/>
-    </w:lvl>
-    <w:lvl w:ilvl="3" w:tplc="6F962C9A">
-      <w:numFmt w:val="decimal"/>
-      <w:lvlText w:val=""/>
-      <w:lvlJc w:val="left"/>
-    </w:lvl>
-    <w:lvl w:ilvl="4" w:tplc="7DFEDDC6">
-      <w:numFmt w:val="decimal"/>
-      <w:lvlText w:val=""/>
-      <w:lvlJc w:val="left"/>
-    </w:lvl>
-    <w:lvl w:ilvl="5" w:tplc="91F28F76">
-      <w:numFmt w:val="decimal"/>
-      <w:lvlText w:val=""/>
-      <w:lvlJc w:val="left"/>
-    </w:lvl>
-    <w:lvl w:ilvl="6" w:tplc="2C82CA74">
-      <w:numFmt w:val="decimal"/>
-      <w:lvlText w:val=""/>
-      <w:lvlJc w:val="left"/>
-    </w:lvl>
-    <w:lvl w:ilvl="7" w:tplc="4DA880A2">
-      <w:numFmt w:val="decimal"/>
-      <w:lvlText w:val=""/>
-      <w:lvlJc w:val="left"/>
-    </w:lvl>
-    <w:lvl w:ilvl="8" w:tplc="5A24804C">
-      <w:numFmt w:val="decimal"/>
-      <w:lvlText w:val=""/>
-      <w:lvlJc w:val="left"/>
-    </w:lvl>
-  </w:abstractNum>
   <w:num w:numId="1">
+    <w:abstractNumId w:val="2"/>
+    <w:lvlOverride w:ilvl="0">
+      <w:startOverride w:val="1"/>
+    </w:lvlOverride>
+  </w:num>
+  <w:num w:numId="2">
     <w:abstractNumId w:val="0"/>
     <w:lvlOverride w:ilvl="0">
       <w:startOverride w:val="1"/>
     </w:lvlOverride>
   </w:num>
-  <w:num w:numId="2">
+  <w:num w:numId="3">
     <w:abstractNumId w:val="1"/>
     <w:lvlOverride w:ilvl="0">
       <w:startOverride w:val="1"/>
     </w:lvlOverride>
   </w:num>
-  <w:num w:numId="3">
-    <w:abstractNumId w:val="2"/>
-    <w:lvlOverride w:ilvl="0">
-      <w:startOverride w:val="1"/>
-    </w:lvlOverride>
-  </w:num>
   <w:num w:numId="4">
-    <w:abstractNumId w:val="2"/>
+    <w:abstractNumId w:val="1"/>
     <w:lvlOverride w:ilvl="0">
       <w:startOverride w:val="1"/>
     </w:lvlOverride>
   </w:num>
   <w:num w:numId="5">
-    <w:abstractNumId w:val="2"/>
+    <w:abstractNumId w:val="1"/>
     <w:lvlOverride w:ilvl="0">
       <w:startOverride w:val="1"/>
     </w:lvlOverride>
   </w:num>
   <w:num w:numId="6">
-    <w:abstractNumId w:val="2"/>
+    <w:abstractNumId w:val="1"/>
     <w:lvlOverride w:ilvl="0">
       <w:startOverride w:val="1"/>
     </w:lvlOverride>
   </w:num>
   <w:num w:numId="7">
-    <w:abstractNumId w:val="2"/>
+    <w:abstractNumId w:val="1"/>
     <w:lvlOverride w:ilvl="0">
       <w:startOverride w:val="1"/>
     </w:lvlOverride>
   </w:num>
   <w:num w:numId="8">
-    <w:abstractNumId w:val="2"/>
+    <w:abstractNumId w:val="1"/>
     <w:lvlOverride w:ilvl="0">
       <w:startOverride w:val="1"/>
     </w:lvlOverride>
   </w:num>
   <w:num w:numId="9">
-    <w:abstractNumId w:val="2"/>
+    <w:abstractNumId w:val="1"/>
     <w:lvlOverride w:ilvl="0">
       <w:startOverride w:val="1"/>
     </w:lvlOverride>
@@ -47147,7 +47655,7 @@
     <w:autoRedefine/>
     <w:uiPriority w:val="39"/>
     <w:unhideWhenUsed/>
-    <w:rsid w:val="003E0939"/>
+    <w:rsid w:val="00DC6F91"/>
     <w:pPr>
       <w:spacing w:after="100"/>
     </w:pPr>
@@ -47159,7 +47667,7 @@
     <w:autoRedefine/>
     <w:uiPriority w:val="39"/>
     <w:unhideWhenUsed/>
-    <w:rsid w:val="003E0939"/>
+    <w:rsid w:val="00DC6F91"/>
     <w:pPr>
       <w:spacing w:after="100"/>
       <w:ind w:left="220"/>

</xml_diff>